<commit_message>
Added questions for self-check. Marked module 8 as done
</commit_message>
<xml_diff>
--- a/06.CodeQuality/Hometask.docx
+++ b/06.CodeQuality/Hometask.docx
@@ -24,23 +24,13 @@
           <w:iCs/>
         </w:rPr>
       </w:pPr>
-      <w:proofErr w:type="gramStart"/>
       <w:r>
         <w:rPr>
           <w:rFonts w:ascii="Verdana" w:hAnsi="Verdana"/>
           <w:i/>
           <w:iCs/>
         </w:rPr>
-        <w:t>Please,</w:t>
-      </w:r>
-      <w:proofErr w:type="gramEnd"/>
-      <w:r>
-        <w:rPr>
-          <w:rFonts w:ascii="Verdana" w:hAnsi="Verdana"/>
-          <w:i/>
-          <w:iCs/>
-        </w:rPr>
-        <w:t xml:space="preserve"> complete the following task:</w:t>
+        <w:t>Please, complete the following task:</w:t>
       </w:r>
     </w:p>
     <w:p>
@@ -55,7 +45,7 @@
           <w:b/>
           <w:bCs/>
         </w:rPr>
-        <w:t>Tasks 1:</w:t>
+        <w:t>Task 1:</w:t>
       </w:r>
     </w:p>
     <w:p>
@@ -66,19 +56,11 @@
           <w:rFonts w:ascii="Verdana" w:hAnsi="Verdana"/>
         </w:rPr>
       </w:pPr>
-      <w:proofErr w:type="gramStart"/>
-      <w:r>
-        <w:rPr>
-          <w:rFonts w:ascii="Verdana" w:hAnsi="Verdana"/>
-        </w:rPr>
-        <w:t>Setup</w:t>
-      </w:r>
-      <w:proofErr w:type="gramEnd"/>
-      <w:r>
-        <w:rPr>
-          <w:rFonts w:ascii="Verdana" w:hAnsi="Verdana"/>
-        </w:rPr>
-        <w:t xml:space="preserve"> code-style and analyzers for the projects created during this course so every potential team member would follow the same style and rules.</w:t>
+      <w:r>
+        <w:rPr>
+          <w:rFonts w:ascii="Verdana" w:hAnsi="Verdana"/>
+        </w:rPr>
+        <w:t>Setup code-style and analyzers for the projects created during this course so every potential team member would follow the same style and rules.</w:t>
       </w:r>
     </w:p>
     <w:p>
@@ -161,21 +143,7 @@
         <w:rPr>
           <w:rFonts w:ascii="Verdana" w:hAnsi="Verdana"/>
         </w:rPr>
-        <w:t>Enforce check of the sorted using statements (</w:t>
-      </w:r>
-      <w:proofErr w:type="spellStart"/>
-      <w:r>
-        <w:rPr>
-          <w:rFonts w:ascii="Verdana" w:hAnsi="Verdana"/>
-        </w:rPr>
-        <w:t>dotnet_sort_system_directives_first</w:t>
-      </w:r>
-      <w:proofErr w:type="spellEnd"/>
-      <w:r>
-        <w:rPr>
-          <w:rFonts w:ascii="Verdana" w:hAnsi="Verdana"/>
-        </w:rPr>
-        <w:t>). Add 2-3 additional checks that aren’t enabled by default.</w:t>
+        <w:t>Enforce check of the sorted using statements (dotnet_sort_system_directives_first). Add 2-3 additional checks that aren’t enabled by default.</w:t>
       </w:r>
     </w:p>
     <w:p>
@@ -193,21 +161,7 @@
         <w:rPr>
           <w:rFonts w:ascii="Verdana" w:hAnsi="Verdana"/>
         </w:rPr>
-        <w:t xml:space="preserve">(Optional) Implement </w:t>
-      </w:r>
-      <w:proofErr w:type="gramStart"/>
-      <w:r>
-        <w:rPr>
-          <w:rFonts w:ascii="Verdana" w:hAnsi="Verdana"/>
-        </w:rPr>
-        <w:t>git</w:t>
-      </w:r>
-      <w:proofErr w:type="gramEnd"/>
-      <w:r>
-        <w:rPr>
-          <w:rFonts w:ascii="Verdana" w:hAnsi="Verdana"/>
-        </w:rPr>
-        <w:t xml:space="preserve"> pre-push validation using dotnet-format tool to check for consistent styling and rules.</w:t>
+        <w:t>(Optional) Implement git pre-push validation using dotnet-format tool to check for consistent styling and rules.</w:t>
       </w:r>
     </w:p>
     <w:p>
@@ -420,21 +374,7 @@
         <w:rPr>
           <w:rFonts w:ascii="Verdana" w:hAnsi="Verdana"/>
         </w:rPr>
-        <w:t xml:space="preserve">How to ensure every team member </w:t>
-      </w:r>
-      <w:proofErr w:type="gramStart"/>
-      <w:r>
-        <w:rPr>
-          <w:rFonts w:ascii="Verdana" w:hAnsi="Verdana"/>
-        </w:rPr>
-        <w:t>will follow</w:t>
-      </w:r>
-      <w:proofErr w:type="gramEnd"/>
-      <w:r>
-        <w:rPr>
-          <w:rFonts w:ascii="Verdana" w:hAnsi="Verdana"/>
-        </w:rPr>
-        <w:t xml:space="preserve"> a style guide? How to apply style guide for the legacy projects?</w:t>
+        <w:t>How to ensure every team member will follow a style guide? How to apply style guide for the legacy projects?</w:t>
       </w:r>
     </w:p>
     <w:p>
@@ -461,21 +401,7 @@
         <w:rPr>
           <w:rFonts w:ascii="Verdana" w:hAnsi="Verdana"/>
         </w:rPr>
-        <w:t xml:space="preserve">Which are the pros and cons of the SonarQube analyzer? Think of a criterion to </w:t>
-      </w:r>
-      <w:proofErr w:type="gramStart"/>
-      <w:r>
-        <w:rPr>
-          <w:rFonts w:ascii="Verdana" w:hAnsi="Verdana"/>
-        </w:rPr>
-        <w:t>use it</w:t>
-      </w:r>
-      <w:proofErr w:type="gramEnd"/>
-      <w:r>
-        <w:rPr>
-          <w:rFonts w:ascii="Verdana" w:hAnsi="Verdana"/>
-        </w:rPr>
-        <w:t xml:space="preserve"> on a project?</w:t>
+        <w:t>Which are the pros and cons of the SonarQube analyzer? Think of a criterion to use it on a project?</w:t>
       </w:r>
     </w:p>
     <w:p>
@@ -642,9 +568,20 @@
           <w:rFonts w:ascii="Verdana" w:hAnsi="Verdana"/>
         </w:rPr>
       </w:pPr>
-    </w:p>
-    <w:p>
-      <w:pPr>
+      <w:r>
+        <w:rPr>
+          <w:rFonts w:ascii="Verdana" w:hAnsi="Verdana"/>
+        </w:rPr>
+        <w:t>NFRs affected by code quality:</w:t>
+      </w:r>
+    </w:p>
+    <w:p>
+      <w:pPr>
+        <w:pStyle w:val="ListParagraph"/>
+        <w:numPr>
+          <w:ilvl w:val="0"/>
+          <w:numId w:val="37"/>
+        </w:numPr>
         <w:spacing w:before="100" w:beforeAutospacing="1" w:line="240" w:lineRule="auto"/>
         <w:jc w:val="both"/>
         <w:rPr>
@@ -655,26 +592,36 @@
         <w:rPr>
           <w:rFonts w:ascii="Verdana" w:hAnsi="Verdana"/>
         </w:rPr>
-        <w:t xml:space="preserve">2. </w:t>
-      </w:r>
-      <w:r>
-        <w:rPr>
-          <w:rFonts w:ascii="Verdana" w:hAnsi="Verdana"/>
-        </w:rPr>
-        <w:t>What are the goals of static code analysis? How many code analyzers can be used on a project?</w:t>
-      </w:r>
-    </w:p>
-    <w:p>
-      <w:pPr>
+        <w:t>Maintainability – ease of understanding, modifying, and extending the code.</w:t>
+      </w:r>
+    </w:p>
+    <w:p>
+      <w:pPr>
+        <w:pStyle w:val="ListParagraph"/>
+        <w:numPr>
+          <w:ilvl w:val="0"/>
+          <w:numId w:val="37"/>
+        </w:numPr>
         <w:spacing w:before="100" w:beforeAutospacing="1" w:line="240" w:lineRule="auto"/>
         <w:jc w:val="both"/>
         <w:rPr>
           <w:rFonts w:ascii="Verdana" w:hAnsi="Verdana"/>
         </w:rPr>
       </w:pPr>
-    </w:p>
-    <w:p>
-      <w:pPr>
+      <w:r>
+        <w:rPr>
+          <w:rFonts w:ascii="Verdana" w:hAnsi="Verdana"/>
+        </w:rPr>
+        <w:t>Performance/Efficiency – optimized code, minimal resource overhead.</w:t>
+      </w:r>
+    </w:p>
+    <w:p>
+      <w:pPr>
+        <w:pStyle w:val="ListParagraph"/>
+        <w:numPr>
+          <w:ilvl w:val="0"/>
+          <w:numId w:val="37"/>
+        </w:numPr>
         <w:spacing w:before="100" w:beforeAutospacing="1" w:line="240" w:lineRule="auto"/>
         <w:jc w:val="both"/>
         <w:rPr>
@@ -685,40 +632,36 @@
         <w:rPr>
           <w:rFonts w:ascii="Verdana" w:hAnsi="Verdana"/>
         </w:rPr>
-        <w:t xml:space="preserve">3. </w:t>
-      </w:r>
-      <w:r>
-        <w:rPr>
-          <w:rFonts w:ascii="Verdana" w:hAnsi="Verdana"/>
-        </w:rPr>
-        <w:t xml:space="preserve">How to ensure every team member </w:t>
-      </w:r>
-      <w:proofErr w:type="gramStart"/>
-      <w:r>
-        <w:rPr>
-          <w:rFonts w:ascii="Verdana" w:hAnsi="Verdana"/>
-        </w:rPr>
-        <w:t>will follow</w:t>
-      </w:r>
-      <w:proofErr w:type="gramEnd"/>
-      <w:r>
-        <w:rPr>
-          <w:rFonts w:ascii="Verdana" w:hAnsi="Verdana"/>
-        </w:rPr>
-        <w:t xml:space="preserve"> a style guide? How to apply style guide for the legacy projects?</w:t>
-      </w:r>
-    </w:p>
-    <w:p>
-      <w:pPr>
+        <w:t>Reliability – fewer bugs, predictable behavior.</w:t>
+      </w:r>
+    </w:p>
+    <w:p>
+      <w:pPr>
+        <w:pStyle w:val="ListParagraph"/>
+        <w:numPr>
+          <w:ilvl w:val="0"/>
+          <w:numId w:val="37"/>
+        </w:numPr>
         <w:spacing w:before="100" w:beforeAutospacing="1" w:line="240" w:lineRule="auto"/>
         <w:jc w:val="both"/>
         <w:rPr>
           <w:rFonts w:ascii="Verdana" w:hAnsi="Verdana"/>
         </w:rPr>
       </w:pPr>
-    </w:p>
-    <w:p>
-      <w:pPr>
+      <w:r>
+        <w:rPr>
+          <w:rFonts w:ascii="Verdana" w:hAnsi="Verdana"/>
+        </w:rPr>
+        <w:t>Security – resilient code with minimal vulnerabilities.</w:t>
+      </w:r>
+    </w:p>
+    <w:p>
+      <w:pPr>
+        <w:pStyle w:val="ListParagraph"/>
+        <w:numPr>
+          <w:ilvl w:val="0"/>
+          <w:numId w:val="37"/>
+        </w:numPr>
         <w:spacing w:before="100" w:beforeAutospacing="1" w:line="240" w:lineRule="auto"/>
         <w:jc w:val="both"/>
         <w:rPr>
@@ -729,46 +672,36 @@
         <w:rPr>
           <w:rFonts w:ascii="Verdana" w:hAnsi="Verdana"/>
         </w:rPr>
-        <w:t>4</w:t>
-      </w:r>
-      <w:r>
-        <w:rPr>
-          <w:rFonts w:ascii="Verdana" w:hAnsi="Verdana"/>
-        </w:rPr>
-        <w:t xml:space="preserve">. </w:t>
-      </w:r>
-      <w:r>
-        <w:rPr>
-          <w:rFonts w:ascii="Verdana" w:hAnsi="Verdana"/>
-        </w:rPr>
-        <w:t xml:space="preserve">Which are the pros and cons of the SonarQube analyzer? Think of a criterion to </w:t>
-      </w:r>
-      <w:proofErr w:type="gramStart"/>
-      <w:r>
-        <w:rPr>
-          <w:rFonts w:ascii="Verdana" w:hAnsi="Verdana"/>
-        </w:rPr>
-        <w:t>use it</w:t>
-      </w:r>
-      <w:proofErr w:type="gramEnd"/>
-      <w:r>
-        <w:rPr>
-          <w:rFonts w:ascii="Verdana" w:hAnsi="Verdana"/>
-        </w:rPr>
-        <w:t xml:space="preserve"> on a project?</w:t>
-      </w:r>
-    </w:p>
-    <w:p>
-      <w:pPr>
+        <w:t>Portability/Compatibility – ability to run on various environments with minimal change.</w:t>
+      </w:r>
+    </w:p>
+    <w:p>
+      <w:pPr>
+        <w:pStyle w:val="ListParagraph"/>
+        <w:numPr>
+          <w:ilvl w:val="0"/>
+          <w:numId w:val="37"/>
+        </w:numPr>
         <w:spacing w:before="100" w:beforeAutospacing="1" w:line="240" w:lineRule="auto"/>
         <w:jc w:val="both"/>
         <w:rPr>
           <w:rFonts w:ascii="Verdana" w:hAnsi="Verdana"/>
         </w:rPr>
       </w:pPr>
-    </w:p>
-    <w:p>
-      <w:pPr>
+      <w:r>
+        <w:rPr>
+          <w:rFonts w:ascii="Verdana" w:hAnsi="Verdana"/>
+        </w:rPr>
+        <w:t>Understandability – clarity for future developers.</w:t>
+      </w:r>
+    </w:p>
+    <w:p>
+      <w:pPr>
+        <w:pStyle w:val="ListParagraph"/>
+        <w:numPr>
+          <w:ilvl w:val="0"/>
+          <w:numId w:val="37"/>
+        </w:numPr>
         <w:spacing w:before="100" w:beforeAutospacing="1" w:line="240" w:lineRule="auto"/>
         <w:jc w:val="both"/>
         <w:rPr>
@@ -779,13 +712,25 @@
         <w:rPr>
           <w:rFonts w:ascii="Verdana" w:hAnsi="Verdana"/>
         </w:rPr>
-        <w:t xml:space="preserve">5. </w:t>
-      </w:r>
-      <w:r>
-        <w:rPr>
-          <w:rFonts w:ascii="Verdana" w:hAnsi="Verdana"/>
-        </w:rPr>
-        <w:t>What are the quality gates?</w:t>
+        <w:t>Testability</w:t>
+      </w:r>
+      <w:r>
+        <w:rPr>
+          <w:rFonts w:ascii="Verdana" w:hAnsi="Verdana"/>
+        </w:rPr>
+        <w:t xml:space="preserve"> –</w:t>
+      </w:r>
+      <w:r>
+        <w:rPr>
+          <w:rFonts w:ascii="Verdana" w:hAnsi="Verdana"/>
+        </w:rPr>
+        <w:t xml:space="preserve"> </w:t>
+      </w:r>
+      <w:r>
+        <w:rPr>
+          <w:rFonts w:ascii="Verdana" w:hAnsi="Verdana"/>
+        </w:rPr>
+        <w:t>good code quality usually means easy automation testing.</w:t>
       </w:r>
     </w:p>
     <w:p>
@@ -796,6 +741,1102 @@
           <w:rFonts w:ascii="Verdana" w:hAnsi="Verdana"/>
         </w:rPr>
       </w:pPr>
+      <w:r>
+        <w:rPr>
+          <w:rFonts w:ascii="Verdana" w:hAnsi="Verdana"/>
+        </w:rPr>
+        <w:t>Code quality metrics examples:</w:t>
+      </w:r>
+    </w:p>
+    <w:p>
+      <w:pPr>
+        <w:pStyle w:val="ListParagraph"/>
+        <w:numPr>
+          <w:ilvl w:val="0"/>
+          <w:numId w:val="38"/>
+        </w:numPr>
+        <w:spacing w:before="100" w:beforeAutospacing="1" w:line="240" w:lineRule="auto"/>
+        <w:jc w:val="both"/>
+        <w:rPr>
+          <w:rFonts w:ascii="Verdana" w:hAnsi="Verdana"/>
+        </w:rPr>
+      </w:pPr>
+      <w:r>
+        <w:rPr>
+          <w:rFonts w:ascii="Verdana" w:hAnsi="Verdana"/>
+        </w:rPr>
+        <w:t>Cyclomatic Complexity – measures logic complexity.</w:t>
+      </w:r>
+    </w:p>
+    <w:p>
+      <w:pPr>
+        <w:pStyle w:val="ListParagraph"/>
+        <w:numPr>
+          <w:ilvl w:val="0"/>
+          <w:numId w:val="38"/>
+        </w:numPr>
+        <w:spacing w:before="100" w:beforeAutospacing="1" w:line="240" w:lineRule="auto"/>
+        <w:jc w:val="both"/>
+        <w:rPr>
+          <w:rFonts w:ascii="Verdana" w:hAnsi="Verdana"/>
+        </w:rPr>
+      </w:pPr>
+      <w:r>
+        <w:rPr>
+          <w:rFonts w:ascii="Verdana" w:hAnsi="Verdana"/>
+        </w:rPr>
+        <w:t>Code Coverage (%) – proportion of code executed by tests.</w:t>
+      </w:r>
+    </w:p>
+    <w:p>
+      <w:pPr>
+        <w:pStyle w:val="ListParagraph"/>
+        <w:numPr>
+          <w:ilvl w:val="0"/>
+          <w:numId w:val="38"/>
+        </w:numPr>
+        <w:spacing w:before="100" w:beforeAutospacing="1" w:line="240" w:lineRule="auto"/>
+        <w:jc w:val="both"/>
+        <w:rPr>
+          <w:rFonts w:ascii="Verdana" w:hAnsi="Verdana"/>
+        </w:rPr>
+      </w:pPr>
+      <w:r>
+        <w:rPr>
+          <w:rFonts w:ascii="Verdana" w:hAnsi="Verdana"/>
+        </w:rPr>
+        <w:t>Duplication (%) – portion of code repeated across the codebase.</w:t>
+      </w:r>
+    </w:p>
+    <w:p>
+      <w:pPr>
+        <w:pStyle w:val="ListParagraph"/>
+        <w:numPr>
+          <w:ilvl w:val="0"/>
+          <w:numId w:val="38"/>
+        </w:numPr>
+        <w:spacing w:before="100" w:beforeAutospacing="1" w:line="240" w:lineRule="auto"/>
+        <w:jc w:val="both"/>
+        <w:rPr>
+          <w:rFonts w:ascii="Verdana" w:hAnsi="Verdana"/>
+        </w:rPr>
+      </w:pPr>
+      <w:r>
+        <w:rPr>
+          <w:rFonts w:ascii="Verdana" w:hAnsi="Verdana"/>
+        </w:rPr>
+        <w:t>Linting compliance – adherence to coding standards/style guide.</w:t>
+      </w:r>
+    </w:p>
+    <w:p>
+      <w:pPr>
+        <w:pStyle w:val="ListParagraph"/>
+        <w:numPr>
+          <w:ilvl w:val="0"/>
+          <w:numId w:val="38"/>
+        </w:numPr>
+        <w:spacing w:before="100" w:beforeAutospacing="1" w:line="240" w:lineRule="auto"/>
+        <w:jc w:val="both"/>
+        <w:rPr>
+          <w:rFonts w:ascii="Verdana" w:hAnsi="Verdana"/>
+        </w:rPr>
+      </w:pPr>
+      <w:r>
+        <w:rPr>
+          <w:rFonts w:ascii="Verdana" w:hAnsi="Verdana"/>
+        </w:rPr>
+        <w:t>Number of Code Smells – maintainability issues detected by static analysis.</w:t>
+      </w:r>
+    </w:p>
+    <w:p>
+      <w:pPr>
+        <w:pStyle w:val="ListParagraph"/>
+        <w:numPr>
+          <w:ilvl w:val="0"/>
+          <w:numId w:val="38"/>
+        </w:numPr>
+        <w:spacing w:before="100" w:beforeAutospacing="1" w:line="240" w:lineRule="auto"/>
+        <w:jc w:val="both"/>
+        <w:rPr>
+          <w:rFonts w:ascii="Verdana" w:hAnsi="Verdana"/>
+        </w:rPr>
+      </w:pPr>
+      <w:r>
+        <w:rPr>
+          <w:rFonts w:ascii="Verdana" w:hAnsi="Verdana"/>
+        </w:rPr>
+        <w:t>Security vulnerabilities – count &amp; severity.</w:t>
+      </w:r>
+    </w:p>
+    <w:p>
+      <w:pPr>
+        <w:spacing w:before="100" w:beforeAutospacing="1" w:line="240" w:lineRule="auto"/>
+        <w:jc w:val="both"/>
+        <w:rPr>
+          <w:rFonts w:ascii="Verdana" w:hAnsi="Verdana"/>
+        </w:rPr>
+      </w:pPr>
+      <w:r>
+        <w:rPr>
+          <w:rFonts w:ascii="Verdana" w:hAnsi="Verdana"/>
+        </w:rPr>
+        <w:t>High-quality code meets thresholds in these metrics and aligns with agreed standards.</w:t>
+      </w:r>
+    </w:p>
+    <w:p>
+      <w:pPr>
+        <w:spacing w:before="100" w:beforeAutospacing="1" w:line="240" w:lineRule="auto"/>
+        <w:jc w:val="both"/>
+        <w:rPr>
+          <w:rFonts w:ascii="Verdana" w:hAnsi="Verdana"/>
+        </w:rPr>
+      </w:pPr>
+      <w:r>
+        <w:rPr>
+          <w:rFonts w:ascii="Verdana" w:hAnsi="Verdana"/>
+        </w:rPr>
+        <w:t xml:space="preserve">2. </w:t>
+      </w:r>
+      <w:r>
+        <w:rPr>
+          <w:rFonts w:ascii="Verdana" w:hAnsi="Verdana"/>
+        </w:rPr>
+        <w:t>What are the goals of static code analysis? How many code analyzers can be used on a project?</w:t>
+      </w:r>
+    </w:p>
+    <w:p>
+      <w:pPr>
+        <w:spacing w:before="100" w:beforeAutospacing="1" w:line="240" w:lineRule="auto"/>
+        <w:jc w:val="both"/>
+        <w:rPr>
+          <w:rFonts w:ascii="Verdana" w:hAnsi="Verdana"/>
+        </w:rPr>
+      </w:pPr>
+      <w:r>
+        <w:rPr>
+          <w:rFonts w:ascii="Verdana" w:hAnsi="Verdana"/>
+        </w:rPr>
+        <w:t>Goals of static code analysis:</w:t>
+      </w:r>
+    </w:p>
+    <w:p>
+      <w:pPr>
+        <w:pStyle w:val="ListParagraph"/>
+        <w:numPr>
+          <w:ilvl w:val="0"/>
+          <w:numId w:val="39"/>
+        </w:numPr>
+        <w:spacing w:before="100" w:beforeAutospacing="1" w:line="240" w:lineRule="auto"/>
+        <w:jc w:val="both"/>
+        <w:rPr>
+          <w:rFonts w:ascii="Verdana" w:hAnsi="Verdana"/>
+        </w:rPr>
+      </w:pPr>
+      <w:r>
+        <w:rPr>
+          <w:rFonts w:ascii="Verdana" w:hAnsi="Verdana"/>
+        </w:rPr>
+        <w:t>Style compliance – ensure code matches agreed format (indentation, naming conventions).</w:t>
+      </w:r>
+    </w:p>
+    <w:p>
+      <w:pPr>
+        <w:pStyle w:val="ListParagraph"/>
+        <w:numPr>
+          <w:ilvl w:val="0"/>
+          <w:numId w:val="39"/>
+        </w:numPr>
+        <w:spacing w:before="100" w:beforeAutospacing="1" w:line="240" w:lineRule="auto"/>
+        <w:jc w:val="both"/>
+        <w:rPr>
+          <w:rFonts w:ascii="Verdana" w:hAnsi="Verdana"/>
+        </w:rPr>
+      </w:pPr>
+      <w:r>
+        <w:rPr>
+          <w:rFonts w:ascii="Verdana" w:hAnsi="Verdana"/>
+        </w:rPr>
+        <w:t>Design quality – minimize complexity, improve maintainability.</w:t>
+      </w:r>
+    </w:p>
+    <w:p>
+      <w:pPr>
+        <w:pStyle w:val="ListParagraph"/>
+        <w:numPr>
+          <w:ilvl w:val="0"/>
+          <w:numId w:val="39"/>
+        </w:numPr>
+        <w:spacing w:before="100" w:beforeAutospacing="1" w:line="240" w:lineRule="auto"/>
+        <w:jc w:val="both"/>
+        <w:rPr>
+          <w:rFonts w:ascii="Verdana" w:hAnsi="Verdana"/>
+        </w:rPr>
+      </w:pPr>
+      <w:r>
+        <w:rPr>
+          <w:rFonts w:ascii="Verdana" w:hAnsi="Verdana"/>
+        </w:rPr>
+        <w:t>Error detection – find potential bugs, null pointer issues, unused variables.</w:t>
+      </w:r>
+    </w:p>
+    <w:p>
+      <w:pPr>
+        <w:pStyle w:val="ListParagraph"/>
+        <w:numPr>
+          <w:ilvl w:val="0"/>
+          <w:numId w:val="39"/>
+        </w:numPr>
+        <w:spacing w:before="100" w:beforeAutospacing="1" w:line="240" w:lineRule="auto"/>
+        <w:jc w:val="both"/>
+        <w:rPr>
+          <w:rFonts w:ascii="Verdana" w:hAnsi="Verdana"/>
+        </w:rPr>
+      </w:pPr>
+      <w:r>
+        <w:rPr>
+          <w:rFonts w:ascii="Verdana" w:hAnsi="Verdana"/>
+        </w:rPr>
+        <w:t>Security scanning – detect vulnerabilities early (e.g., SQL injection risks).</w:t>
+      </w:r>
+    </w:p>
+    <w:p>
+      <w:pPr>
+        <w:pStyle w:val="ListParagraph"/>
+        <w:numPr>
+          <w:ilvl w:val="0"/>
+          <w:numId w:val="39"/>
+        </w:numPr>
+        <w:spacing w:before="100" w:beforeAutospacing="1" w:line="240" w:lineRule="auto"/>
+        <w:jc w:val="both"/>
+        <w:rPr>
+          <w:rFonts w:ascii="Verdana" w:hAnsi="Verdana"/>
+        </w:rPr>
+      </w:pPr>
+      <w:r>
+        <w:rPr>
+          <w:rFonts w:ascii="Verdana" w:hAnsi="Verdana"/>
+        </w:rPr>
+        <w:lastRenderedPageBreak/>
+        <w:t>Predictive checks – identify patterns that may cause runtime errors</w:t>
+      </w:r>
+      <w:r>
+        <w:rPr>
+          <w:rFonts w:ascii="Verdana" w:hAnsi="Verdana"/>
+        </w:rPr>
+        <w:t xml:space="preserve"> </w:t>
+      </w:r>
+      <w:r>
+        <w:rPr>
+          <w:rFonts w:ascii="Verdana" w:hAnsi="Verdana"/>
+        </w:rPr>
+        <w:t>without executing the code</w:t>
+      </w:r>
+      <w:r>
+        <w:rPr>
+          <w:rFonts w:ascii="Verdana" w:hAnsi="Verdana"/>
+        </w:rPr>
+        <w:t>.</w:t>
+      </w:r>
+    </w:p>
+    <w:p>
+      <w:pPr>
+        <w:pStyle w:val="ListParagraph"/>
+        <w:numPr>
+          <w:ilvl w:val="0"/>
+          <w:numId w:val="39"/>
+        </w:numPr>
+        <w:spacing w:before="100" w:beforeAutospacing="1" w:line="240" w:lineRule="auto"/>
+        <w:jc w:val="both"/>
+        <w:rPr>
+          <w:rFonts w:ascii="Verdana" w:hAnsi="Verdana"/>
+        </w:rPr>
+      </w:pPr>
+      <w:r>
+        <w:rPr>
+          <w:rFonts w:ascii="Verdana" w:hAnsi="Verdana"/>
+        </w:rPr>
+        <w:t>Formal verification – mathematically prove correctness (rare in most</w:t>
+      </w:r>
+      <w:r>
+        <w:rPr>
+          <w:rFonts w:ascii="Verdana" w:hAnsi="Verdana"/>
+        </w:rPr>
+        <w:t xml:space="preserve"> </w:t>
+      </w:r>
+      <w:r>
+        <w:rPr>
+          <w:rFonts w:ascii="Verdana" w:hAnsi="Verdana"/>
+        </w:rPr>
+        <w:t>general-purpose</w:t>
+      </w:r>
+      <w:r>
+        <w:rPr>
+          <w:rFonts w:ascii="Verdana" w:hAnsi="Verdana"/>
+        </w:rPr>
+        <w:t xml:space="preserve"> projects).</w:t>
+      </w:r>
+    </w:p>
+    <w:p>
+      <w:pPr>
+        <w:spacing w:before="100" w:beforeAutospacing="1" w:line="240" w:lineRule="auto"/>
+        <w:jc w:val="both"/>
+        <w:rPr>
+          <w:rFonts w:ascii="Verdana" w:hAnsi="Verdana"/>
+        </w:rPr>
+      </w:pPr>
+      <w:r>
+        <w:rPr>
+          <w:rFonts w:ascii="Verdana" w:hAnsi="Verdana"/>
+        </w:rPr>
+        <w:t>Number of analyzers:</w:t>
+      </w:r>
+    </w:p>
+    <w:p>
+      <w:pPr>
+        <w:spacing w:before="100" w:beforeAutospacing="1" w:line="240" w:lineRule="auto"/>
+        <w:jc w:val="both"/>
+        <w:rPr>
+          <w:rFonts w:ascii="Verdana" w:hAnsi="Verdana"/>
+        </w:rPr>
+      </w:pPr>
+      <w:r>
+        <w:rPr>
+          <w:rFonts w:ascii="Verdana" w:hAnsi="Verdana"/>
+        </w:rPr>
+        <w:t>No hard limit — in fact, combining analyzers is common: e.g., ESLint for style, SonarQube for quality gates, OWASP tools for security.</w:t>
+      </w:r>
+    </w:p>
+    <w:p>
+      <w:pPr>
+        <w:spacing w:before="100" w:beforeAutospacing="1" w:line="240" w:lineRule="auto"/>
+        <w:jc w:val="both"/>
+        <w:rPr>
+          <w:rFonts w:ascii="Verdana" w:hAnsi="Verdana"/>
+        </w:rPr>
+      </w:pPr>
+      <w:r>
+        <w:rPr>
+          <w:rFonts w:ascii="Verdana" w:hAnsi="Verdana"/>
+        </w:rPr>
+        <w:t xml:space="preserve">3. </w:t>
+      </w:r>
+      <w:r>
+        <w:rPr>
+          <w:rFonts w:ascii="Verdana" w:hAnsi="Verdana"/>
+        </w:rPr>
+        <w:t>How to ensure every team member will follow a style guide? How to apply style guide for the legacy projects?</w:t>
+      </w:r>
+    </w:p>
+    <w:p>
+      <w:pPr>
+        <w:spacing w:before="100" w:beforeAutospacing="1" w:line="240" w:lineRule="auto"/>
+        <w:jc w:val="both"/>
+        <w:rPr>
+          <w:rFonts w:ascii="Verdana" w:hAnsi="Verdana"/>
+        </w:rPr>
+      </w:pPr>
+      <w:r>
+        <w:rPr>
+          <w:rFonts w:ascii="Verdana" w:hAnsi="Verdana"/>
+        </w:rPr>
+        <w:t>Ensuring style guide adherence:</w:t>
+      </w:r>
+    </w:p>
+    <w:p>
+      <w:pPr>
+        <w:pStyle w:val="ListParagraph"/>
+        <w:numPr>
+          <w:ilvl w:val="0"/>
+          <w:numId w:val="40"/>
+        </w:numPr>
+        <w:spacing w:before="100" w:beforeAutospacing="1" w:line="240" w:lineRule="auto"/>
+        <w:jc w:val="both"/>
+        <w:rPr>
+          <w:rFonts w:ascii="Verdana" w:hAnsi="Verdana"/>
+        </w:rPr>
+      </w:pPr>
+      <w:r>
+        <w:rPr>
+          <w:rFonts w:ascii="Verdana" w:hAnsi="Verdana"/>
+        </w:rPr>
+        <w:t>Include a .editorconfig or lint configuration in the repo.</w:t>
+      </w:r>
+    </w:p>
+    <w:p>
+      <w:pPr>
+        <w:pStyle w:val="ListParagraph"/>
+        <w:numPr>
+          <w:ilvl w:val="0"/>
+          <w:numId w:val="40"/>
+        </w:numPr>
+        <w:spacing w:before="100" w:beforeAutospacing="1" w:line="240" w:lineRule="auto"/>
+        <w:jc w:val="both"/>
+        <w:rPr>
+          <w:rFonts w:ascii="Verdana" w:hAnsi="Verdana"/>
+        </w:rPr>
+      </w:pPr>
+      <w:r>
+        <w:rPr>
+          <w:rFonts w:ascii="Verdana" w:hAnsi="Verdana"/>
+        </w:rPr>
+        <w:t>Use IDE integrations to apply styles automatically.</w:t>
+      </w:r>
+    </w:p>
+    <w:p>
+      <w:pPr>
+        <w:pStyle w:val="ListParagraph"/>
+        <w:numPr>
+          <w:ilvl w:val="0"/>
+          <w:numId w:val="40"/>
+        </w:numPr>
+        <w:spacing w:before="100" w:beforeAutospacing="1" w:line="240" w:lineRule="auto"/>
+        <w:jc w:val="both"/>
+        <w:rPr>
+          <w:rFonts w:ascii="Verdana" w:hAnsi="Verdana"/>
+        </w:rPr>
+      </w:pPr>
+      <w:r>
+        <w:rPr>
+          <w:rFonts w:ascii="Verdana" w:hAnsi="Verdana"/>
+        </w:rPr>
+        <w:t>Run style checkers locally before commit via git hooks — prevents non-conforming code from reaching the repo.</w:t>
+      </w:r>
+    </w:p>
+    <w:p>
+      <w:pPr>
+        <w:pStyle w:val="ListParagraph"/>
+        <w:numPr>
+          <w:ilvl w:val="0"/>
+          <w:numId w:val="40"/>
+        </w:numPr>
+        <w:spacing w:before="100" w:beforeAutospacing="1" w:line="240" w:lineRule="auto"/>
+        <w:jc w:val="both"/>
+        <w:rPr>
+          <w:rFonts w:ascii="Verdana" w:hAnsi="Verdana"/>
+        </w:rPr>
+      </w:pPr>
+      <w:r>
+        <w:rPr>
+          <w:rFonts w:ascii="Verdana" w:hAnsi="Verdana"/>
+        </w:rPr>
+        <w:t>Add style checks (e.g., ESLint, Checkstyle) to CI/CD pipeline — reject commits that fail.</w:t>
+      </w:r>
+    </w:p>
+    <w:p>
+      <w:pPr>
+        <w:spacing w:before="100" w:beforeAutospacing="1" w:line="240" w:lineRule="auto"/>
+        <w:jc w:val="both"/>
+        <w:rPr>
+          <w:rFonts w:ascii="Verdana" w:hAnsi="Verdana"/>
+        </w:rPr>
+      </w:pPr>
+      <w:r>
+        <w:rPr>
+          <w:rFonts w:ascii="Verdana" w:hAnsi="Verdana"/>
+        </w:rPr>
+        <w:t>Applying to legacy projects:</w:t>
+      </w:r>
+    </w:p>
+    <w:p>
+      <w:pPr>
+        <w:pStyle w:val="ListParagraph"/>
+        <w:numPr>
+          <w:ilvl w:val="0"/>
+          <w:numId w:val="41"/>
+        </w:numPr>
+        <w:spacing w:before="100" w:beforeAutospacing="1" w:line="240" w:lineRule="auto"/>
+        <w:jc w:val="both"/>
+        <w:rPr>
+          <w:rFonts w:ascii="Verdana" w:hAnsi="Verdana"/>
+        </w:rPr>
+      </w:pPr>
+      <w:r>
+        <w:rPr>
+          <w:rFonts w:ascii="Verdana" w:hAnsi="Verdana"/>
+        </w:rPr>
+        <w:t>Gradually reformat code using automated tools (e.g., Format Document</w:t>
+      </w:r>
+      <w:r>
+        <w:rPr>
+          <w:rFonts w:ascii="Verdana" w:hAnsi="Verdana"/>
+        </w:rPr>
+        <w:t xml:space="preserve"> command in</w:t>
+      </w:r>
+      <w:r>
+        <w:rPr>
+          <w:rFonts w:ascii="Verdana" w:hAnsi="Verdana"/>
+        </w:rPr>
+        <w:t xml:space="preserve"> many</w:t>
+      </w:r>
+      <w:r>
+        <w:rPr>
+          <w:rFonts w:ascii="Verdana" w:hAnsi="Verdana"/>
+        </w:rPr>
+        <w:t xml:space="preserve"> IDE</w:t>
+      </w:r>
+      <w:r>
+        <w:rPr>
+          <w:rFonts w:ascii="Verdana" w:hAnsi="Verdana"/>
+        </w:rPr>
+        <w:t>s</w:t>
+      </w:r>
+      <w:r>
+        <w:rPr>
+          <w:rFonts w:ascii="Verdana" w:hAnsi="Verdana"/>
+        </w:rPr>
+        <w:t>).</w:t>
+      </w:r>
+    </w:p>
+    <w:p>
+      <w:pPr>
+        <w:pStyle w:val="ListParagraph"/>
+        <w:numPr>
+          <w:ilvl w:val="0"/>
+          <w:numId w:val="41"/>
+        </w:numPr>
+        <w:spacing w:before="100" w:beforeAutospacing="1" w:line="240" w:lineRule="auto"/>
+        <w:jc w:val="both"/>
+        <w:rPr>
+          <w:rFonts w:ascii="Verdana" w:hAnsi="Verdana"/>
+        </w:rPr>
+      </w:pPr>
+      <w:r>
+        <w:rPr>
+          <w:rFonts w:ascii="Verdana" w:hAnsi="Verdana"/>
+        </w:rPr>
+        <w:t>Apply formatting only to touched files to avoid large diff noise.</w:t>
+      </w:r>
+    </w:p>
+    <w:p>
+      <w:pPr>
+        <w:pStyle w:val="ListParagraph"/>
+        <w:numPr>
+          <w:ilvl w:val="0"/>
+          <w:numId w:val="41"/>
+        </w:numPr>
+        <w:spacing w:before="100" w:beforeAutospacing="1" w:line="240" w:lineRule="auto"/>
+        <w:jc w:val="both"/>
+        <w:rPr>
+          <w:rFonts w:ascii="Verdana" w:hAnsi="Verdana"/>
+        </w:rPr>
+      </w:pPr>
+      <w:r>
+        <w:rPr>
+          <w:rFonts w:ascii="Verdana" w:hAnsi="Verdana"/>
+        </w:rPr>
+        <w:t>Schedule dedicated refactoring sprints if full style conformity is needed.</w:t>
+      </w:r>
+    </w:p>
+    <w:p>
+      <w:pPr>
+        <w:spacing w:before="100" w:beforeAutospacing="1" w:line="240" w:lineRule="auto"/>
+        <w:jc w:val="both"/>
+        <w:rPr>
+          <w:rFonts w:ascii="Verdana" w:hAnsi="Verdana"/>
+        </w:rPr>
+      </w:pPr>
+      <w:r>
+        <w:rPr>
+          <w:rFonts w:ascii="Verdana" w:hAnsi="Verdana"/>
+        </w:rPr>
+        <w:t>4</w:t>
+      </w:r>
+      <w:r>
+        <w:rPr>
+          <w:rFonts w:ascii="Verdana" w:hAnsi="Verdana"/>
+        </w:rPr>
+        <w:t xml:space="preserve">. </w:t>
+      </w:r>
+      <w:r>
+        <w:rPr>
+          <w:rFonts w:ascii="Verdana" w:hAnsi="Verdana"/>
+        </w:rPr>
+        <w:t xml:space="preserve">Which are the pros and cons of the SonarQube analyzer? Think of a criterion to </w:t>
+      </w:r>
+      <w:r>
+        <w:rPr>
+          <w:rFonts w:ascii="Verdana" w:hAnsi="Verdana"/>
+        </w:rPr>
+        <w:t>use</w:t>
+      </w:r>
+      <w:r>
+        <w:rPr>
+          <w:rFonts w:ascii="Verdana" w:hAnsi="Verdana"/>
+        </w:rPr>
+        <w:t xml:space="preserve"> on a project?</w:t>
+      </w:r>
+    </w:p>
+    <w:p>
+      <w:pPr>
+        <w:spacing w:before="100" w:beforeAutospacing="1" w:line="240" w:lineRule="auto"/>
+        <w:jc w:val="both"/>
+        <w:rPr>
+          <w:rFonts w:ascii="Verdana" w:hAnsi="Verdana"/>
+        </w:rPr>
+      </w:pPr>
+      <w:r>
+        <w:rPr>
+          <w:rFonts w:ascii="Verdana" w:hAnsi="Verdana"/>
+        </w:rPr>
+        <w:t>Pros</w:t>
+      </w:r>
+      <w:r>
+        <w:rPr>
+          <w:rFonts w:ascii="Verdana" w:hAnsi="Verdana"/>
+        </w:rPr>
+        <w:t xml:space="preserve"> of SonarQube</w:t>
+      </w:r>
+      <w:r>
+        <w:rPr>
+          <w:rFonts w:ascii="Verdana" w:hAnsi="Verdana"/>
+        </w:rPr>
+        <w:t>:</w:t>
+      </w:r>
+    </w:p>
+    <w:p>
+      <w:pPr>
+        <w:pStyle w:val="ListParagraph"/>
+        <w:numPr>
+          <w:ilvl w:val="0"/>
+          <w:numId w:val="42"/>
+        </w:numPr>
+        <w:spacing w:before="100" w:beforeAutospacing="1" w:line="240" w:lineRule="auto"/>
+        <w:jc w:val="both"/>
+        <w:rPr>
+          <w:rFonts w:ascii="Verdana" w:hAnsi="Verdana"/>
+        </w:rPr>
+      </w:pPr>
+      <w:r>
+        <w:rPr>
+          <w:rFonts w:ascii="Verdana" w:hAnsi="Verdana"/>
+        </w:rPr>
+        <w:t>Improves maintainability by reducing complexity and duplication.</w:t>
+      </w:r>
+    </w:p>
+    <w:p>
+      <w:pPr>
+        <w:pStyle w:val="ListParagraph"/>
+        <w:numPr>
+          <w:ilvl w:val="0"/>
+          <w:numId w:val="42"/>
+        </w:numPr>
+        <w:spacing w:before="100" w:beforeAutospacing="1" w:line="240" w:lineRule="auto"/>
+        <w:jc w:val="both"/>
+        <w:rPr>
+          <w:rFonts w:ascii="Verdana" w:hAnsi="Verdana"/>
+        </w:rPr>
+      </w:pPr>
+      <w:r>
+        <w:rPr>
+          <w:rFonts w:ascii="Verdana" w:hAnsi="Verdana"/>
+        </w:rPr>
+        <w:t>Detects code smells, vulnerabilities, bugs early.</w:t>
+      </w:r>
+    </w:p>
+    <w:p>
+      <w:pPr>
+        <w:pStyle w:val="ListParagraph"/>
+        <w:numPr>
+          <w:ilvl w:val="0"/>
+          <w:numId w:val="42"/>
+        </w:numPr>
+        <w:spacing w:before="100" w:beforeAutospacing="1" w:line="240" w:lineRule="auto"/>
+        <w:jc w:val="both"/>
+        <w:rPr>
+          <w:rFonts w:ascii="Verdana" w:hAnsi="Verdana"/>
+        </w:rPr>
+      </w:pPr>
+      <w:r>
+        <w:rPr>
+          <w:rFonts w:ascii="Verdana" w:hAnsi="Verdana"/>
+        </w:rPr>
+        <w:t>Supports multiple languages and integrates with CI/CD.</w:t>
+      </w:r>
+    </w:p>
+    <w:p>
+      <w:pPr>
+        <w:pStyle w:val="ListParagraph"/>
+        <w:numPr>
+          <w:ilvl w:val="0"/>
+          <w:numId w:val="42"/>
+        </w:numPr>
+        <w:spacing w:before="100" w:beforeAutospacing="1" w:line="240" w:lineRule="auto"/>
+        <w:jc w:val="both"/>
+        <w:rPr>
+          <w:rFonts w:ascii="Verdana" w:hAnsi="Verdana"/>
+        </w:rPr>
+      </w:pPr>
+      <w:r>
+        <w:rPr>
+          <w:rFonts w:ascii="Verdana" w:hAnsi="Verdana"/>
+        </w:rPr>
+        <w:t>Provides continuous feedback to developers.</w:t>
+      </w:r>
+    </w:p>
+    <w:p>
+      <w:pPr>
+        <w:pStyle w:val="ListParagraph"/>
+        <w:numPr>
+          <w:ilvl w:val="0"/>
+          <w:numId w:val="42"/>
+        </w:numPr>
+        <w:spacing w:before="100" w:beforeAutospacing="1" w:line="240" w:lineRule="auto"/>
+        <w:jc w:val="both"/>
+        <w:rPr>
+          <w:rFonts w:ascii="Verdana" w:hAnsi="Verdana"/>
+        </w:rPr>
+      </w:pPr>
+      <w:r>
+        <w:rPr>
+          <w:rFonts w:ascii="Verdana" w:hAnsi="Verdana"/>
+        </w:rPr>
+        <w:t>Defines Quality Gates for consistent releases.</w:t>
+      </w:r>
+    </w:p>
+    <w:p>
+      <w:pPr>
+        <w:pStyle w:val="ListParagraph"/>
+        <w:numPr>
+          <w:ilvl w:val="0"/>
+          <w:numId w:val="42"/>
+        </w:numPr>
+        <w:spacing w:before="100" w:beforeAutospacing="1" w:line="240" w:lineRule="auto"/>
+        <w:jc w:val="both"/>
+        <w:rPr>
+          <w:rFonts w:ascii="Verdana" w:hAnsi="Verdana"/>
+        </w:rPr>
+      </w:pPr>
+      <w:r>
+        <w:rPr>
+          <w:rFonts w:ascii="Verdana" w:hAnsi="Verdana"/>
+        </w:rPr>
+        <w:t>Especially useful for long-lived projects with multiple contributors where code quality trends need tracking over time.</w:t>
+      </w:r>
+    </w:p>
+    <w:p>
+      <w:pPr>
+        <w:spacing w:before="100" w:beforeAutospacing="1" w:line="240" w:lineRule="auto"/>
+        <w:jc w:val="both"/>
+        <w:rPr>
+          <w:rFonts w:ascii="Verdana" w:hAnsi="Verdana"/>
+        </w:rPr>
+      </w:pPr>
+    </w:p>
+    <w:p>
+      <w:pPr>
+        <w:spacing w:before="100" w:beforeAutospacing="1" w:line="240" w:lineRule="auto"/>
+        <w:jc w:val="both"/>
+        <w:rPr>
+          <w:rFonts w:ascii="Verdana" w:hAnsi="Verdana"/>
+        </w:rPr>
+      </w:pPr>
+      <w:r>
+        <w:rPr>
+          <w:rFonts w:ascii="Verdana" w:hAnsi="Verdana"/>
+        </w:rPr>
+        <w:lastRenderedPageBreak/>
+        <w:t>Cons of SonarQube:</w:t>
+      </w:r>
+    </w:p>
+    <w:p>
+      <w:pPr>
+        <w:pStyle w:val="ListParagraph"/>
+        <w:numPr>
+          <w:ilvl w:val="0"/>
+          <w:numId w:val="43"/>
+        </w:numPr>
+        <w:spacing w:before="100" w:beforeAutospacing="1" w:line="240" w:lineRule="auto"/>
+        <w:jc w:val="both"/>
+        <w:rPr>
+          <w:rFonts w:ascii="Verdana" w:hAnsi="Verdana"/>
+        </w:rPr>
+      </w:pPr>
+      <w:r>
+        <w:rPr>
+          <w:rFonts w:ascii="Verdana" w:hAnsi="Verdana"/>
+        </w:rPr>
+        <w:t>Initial setup/configuration can be time-consuming.</w:t>
+      </w:r>
+    </w:p>
+    <w:p>
+      <w:pPr>
+        <w:pStyle w:val="ListParagraph"/>
+        <w:numPr>
+          <w:ilvl w:val="0"/>
+          <w:numId w:val="43"/>
+        </w:numPr>
+        <w:spacing w:before="100" w:beforeAutospacing="1" w:line="240" w:lineRule="auto"/>
+        <w:jc w:val="both"/>
+        <w:rPr>
+          <w:rFonts w:ascii="Verdana" w:hAnsi="Verdana"/>
+        </w:rPr>
+      </w:pPr>
+      <w:r>
+        <w:rPr>
+          <w:rFonts w:ascii="Verdana" w:hAnsi="Verdana"/>
+        </w:rPr>
+        <w:t>May produce false positives or irrelevant warnings.</w:t>
+      </w:r>
+    </w:p>
+    <w:p>
+      <w:pPr>
+        <w:pStyle w:val="ListParagraph"/>
+        <w:numPr>
+          <w:ilvl w:val="0"/>
+          <w:numId w:val="43"/>
+        </w:numPr>
+        <w:spacing w:before="100" w:beforeAutospacing="1" w:line="240" w:lineRule="auto"/>
+        <w:jc w:val="both"/>
+        <w:rPr>
+          <w:rFonts w:ascii="Verdana" w:hAnsi="Verdana"/>
+        </w:rPr>
+      </w:pPr>
+      <w:r>
+        <w:rPr>
+          <w:rFonts w:ascii="Verdana" w:hAnsi="Verdana"/>
+        </w:rPr>
+        <w:t>Requires resources — scanning large projects may slow builds.</w:t>
+      </w:r>
+    </w:p>
+    <w:p>
+      <w:pPr>
+        <w:pStyle w:val="ListParagraph"/>
+        <w:numPr>
+          <w:ilvl w:val="0"/>
+          <w:numId w:val="43"/>
+        </w:numPr>
+        <w:spacing w:before="100" w:beforeAutospacing="1" w:line="240" w:lineRule="auto"/>
+        <w:jc w:val="both"/>
+        <w:rPr>
+          <w:rFonts w:ascii="Verdana" w:hAnsi="Verdana"/>
+        </w:rPr>
+      </w:pPr>
+      <w:r>
+        <w:rPr>
+          <w:rFonts w:ascii="Verdana" w:hAnsi="Verdana"/>
+        </w:rPr>
+        <w:t>Commercial features may require a paid license.</w:t>
+      </w:r>
+    </w:p>
+    <w:p>
+      <w:pPr>
+        <w:spacing w:before="100" w:beforeAutospacing="1" w:line="240" w:lineRule="auto"/>
+        <w:jc w:val="both"/>
+        <w:rPr>
+          <w:rFonts w:ascii="Verdana" w:hAnsi="Verdana"/>
+        </w:rPr>
+      </w:pPr>
+      <w:r>
+        <w:rPr>
+          <w:rFonts w:ascii="Verdana" w:hAnsi="Verdana"/>
+        </w:rPr>
+        <w:t>Criterion for use:</w:t>
+      </w:r>
+    </w:p>
+    <w:p>
+      <w:pPr>
+        <w:spacing w:before="100" w:beforeAutospacing="1" w:line="240" w:lineRule="auto"/>
+        <w:jc w:val="both"/>
+        <w:rPr>
+          <w:rFonts w:ascii="Verdana" w:hAnsi="Verdana"/>
+        </w:rPr>
+      </w:pPr>
+      <w:r>
+        <w:rPr>
+          <w:rFonts w:ascii="Verdana" w:hAnsi="Verdana"/>
+        </w:rPr>
+        <w:t>Use SonarQube when you need continuous code quality monitoring, measurable quality gates, and integration with existing pipelines.</w:t>
+      </w:r>
+    </w:p>
+    <w:p>
+      <w:pPr>
+        <w:spacing w:before="100" w:beforeAutospacing="1" w:line="240" w:lineRule="auto"/>
+        <w:jc w:val="both"/>
+        <w:rPr>
+          <w:rFonts w:ascii="Verdana" w:hAnsi="Verdana"/>
+        </w:rPr>
+      </w:pPr>
+      <w:r>
+        <w:rPr>
+          <w:rFonts w:ascii="Verdana" w:hAnsi="Verdana"/>
+        </w:rPr>
+        <w:t xml:space="preserve">5. </w:t>
+      </w:r>
+      <w:r>
+        <w:rPr>
+          <w:rFonts w:ascii="Verdana" w:hAnsi="Verdana"/>
+        </w:rPr>
+        <w:t>What are the quality gates?</w:t>
+      </w:r>
+    </w:p>
+    <w:p>
+      <w:pPr>
+        <w:spacing w:before="100" w:beforeAutospacing="1" w:line="240" w:lineRule="auto"/>
+        <w:jc w:val="both"/>
+        <w:rPr>
+          <w:rFonts w:ascii="Verdana" w:hAnsi="Verdana"/>
+        </w:rPr>
+      </w:pPr>
+      <w:r>
+        <w:rPr>
+          <w:rFonts w:ascii="Verdana" w:hAnsi="Verdana"/>
+        </w:rPr>
+        <w:t>Quality Gates:</w:t>
+      </w:r>
+    </w:p>
+    <w:p>
+      <w:pPr>
+        <w:spacing w:before="100" w:beforeAutospacing="1" w:line="240" w:lineRule="auto"/>
+        <w:jc w:val="both"/>
+        <w:rPr>
+          <w:rFonts w:ascii="Verdana" w:hAnsi="Verdana"/>
+        </w:rPr>
+      </w:pPr>
+      <w:r>
+        <w:rPr>
+          <w:rFonts w:ascii="Verdana" w:hAnsi="Verdana"/>
+        </w:rPr>
+        <w:t>A set of predefined conditions that must be met before code can be released to production.</w:t>
+      </w:r>
+    </w:p>
+    <w:p>
+      <w:pPr>
+        <w:spacing w:before="100" w:beforeAutospacing="1" w:line="240" w:lineRule="auto"/>
+        <w:jc w:val="both"/>
+        <w:rPr>
+          <w:rFonts w:ascii="Verdana" w:hAnsi="Verdana"/>
+        </w:rPr>
+      </w:pPr>
+      <w:r>
+        <w:rPr>
+          <w:rFonts w:ascii="Verdana" w:hAnsi="Verdana"/>
+        </w:rPr>
+        <w:t>Examples:</w:t>
+      </w:r>
+    </w:p>
+    <w:p>
+      <w:pPr>
+        <w:pStyle w:val="ListParagraph"/>
+        <w:numPr>
+          <w:ilvl w:val="0"/>
+          <w:numId w:val="33"/>
+        </w:numPr>
+        <w:spacing w:before="100" w:beforeAutospacing="1" w:line="240" w:lineRule="auto"/>
+        <w:jc w:val="both"/>
+        <w:rPr>
+          <w:rFonts w:ascii="Verdana" w:hAnsi="Verdana"/>
+        </w:rPr>
+      </w:pPr>
+      <w:r>
+        <w:rPr>
+          <w:rFonts w:ascii="Verdana" w:hAnsi="Verdana"/>
+        </w:rPr>
+        <w:t>Coverage ≥ defined threshold (e.g., 80%)</w:t>
+      </w:r>
+      <w:r>
+        <w:rPr>
+          <w:rFonts w:ascii="Verdana" w:hAnsi="Verdana"/>
+        </w:rPr>
+        <w:t>.</w:t>
+      </w:r>
+    </w:p>
+    <w:p>
+      <w:pPr>
+        <w:pStyle w:val="ListParagraph"/>
+        <w:numPr>
+          <w:ilvl w:val="0"/>
+          <w:numId w:val="33"/>
+        </w:numPr>
+        <w:spacing w:before="100" w:beforeAutospacing="1" w:line="240" w:lineRule="auto"/>
+        <w:jc w:val="both"/>
+        <w:rPr>
+          <w:rFonts w:ascii="Verdana" w:hAnsi="Verdana"/>
+        </w:rPr>
+      </w:pPr>
+      <w:r>
+        <w:rPr>
+          <w:rFonts w:ascii="Verdana" w:hAnsi="Verdana"/>
+        </w:rPr>
+        <w:t>No blocker or critical bugs</w:t>
+      </w:r>
+      <w:r>
+        <w:rPr>
+          <w:rFonts w:ascii="Verdana" w:hAnsi="Verdana"/>
+        </w:rPr>
+        <w:t>.</w:t>
+      </w:r>
+    </w:p>
+    <w:p>
+      <w:pPr>
+        <w:pStyle w:val="ListParagraph"/>
+        <w:numPr>
+          <w:ilvl w:val="0"/>
+          <w:numId w:val="33"/>
+        </w:numPr>
+        <w:spacing w:before="100" w:beforeAutospacing="1" w:line="240" w:lineRule="auto"/>
+        <w:jc w:val="both"/>
+        <w:rPr>
+          <w:rFonts w:ascii="Verdana" w:hAnsi="Verdana"/>
+        </w:rPr>
+      </w:pPr>
+      <w:r>
+        <w:rPr>
+          <w:rFonts w:ascii="Verdana" w:hAnsi="Verdana"/>
+        </w:rPr>
+        <w:t>Security rating meets policy</w:t>
+      </w:r>
+      <w:r>
+        <w:rPr>
+          <w:rFonts w:ascii="Verdana" w:hAnsi="Verdana"/>
+        </w:rPr>
+        <w:t>.</w:t>
+      </w:r>
+    </w:p>
+    <w:p>
+      <w:pPr>
+        <w:pStyle w:val="ListParagraph"/>
+        <w:numPr>
+          <w:ilvl w:val="0"/>
+          <w:numId w:val="33"/>
+        </w:numPr>
+        <w:spacing w:before="100" w:beforeAutospacing="1" w:line="240" w:lineRule="auto"/>
+        <w:jc w:val="both"/>
+        <w:rPr>
+          <w:rFonts w:ascii="Verdana" w:hAnsi="Verdana"/>
+        </w:rPr>
+      </w:pPr>
+      <w:r>
+        <w:rPr>
+          <w:rFonts w:ascii="Verdana" w:hAnsi="Verdana"/>
+        </w:rPr>
+        <w:t>Maintainability rating within limits</w:t>
+      </w:r>
+      <w:r>
+        <w:rPr>
+          <w:rFonts w:ascii="Verdana" w:hAnsi="Verdana"/>
+        </w:rPr>
+        <w:t>.</w:t>
+      </w:r>
+    </w:p>
+    <w:p>
+      <w:pPr>
+        <w:pStyle w:val="ListParagraph"/>
+        <w:numPr>
+          <w:ilvl w:val="0"/>
+          <w:numId w:val="33"/>
+        </w:numPr>
+        <w:spacing w:before="100" w:beforeAutospacing="1" w:line="240" w:lineRule="auto"/>
+        <w:jc w:val="both"/>
+        <w:rPr>
+          <w:rFonts w:ascii="Verdana" w:hAnsi="Verdana"/>
+        </w:rPr>
+      </w:pPr>
+      <w:r>
+        <w:rPr>
+          <w:rFonts w:ascii="Verdana" w:hAnsi="Verdana"/>
+        </w:rPr>
+        <w:t>Quality gates ensure code meets agreed standards before release, making quality measurable and enforceable.</w:t>
+      </w:r>
     </w:p>
     <w:sectPr>
       <w:pgSz w:w="12240" w:h="15840"/>
@@ -1185,6 +2226,119 @@
     </w:lvl>
   </w:abstractNum>
   <w:abstractNum w:abstractNumId="3" w15:restartNumberingAfterBreak="0">
+    <w:nsid w:val="06B153FC"/>
+    <w:multiLevelType w:val="hybridMultilevel"/>
+    <w:tmpl w:val="5E569C52"/>
+    <w:lvl w:ilvl="0" w:tplc="04090001">
+      <w:start w:val="1"/>
+      <w:numFmt w:val="bullet"/>
+      <w:lvlText w:val=""/>
+      <w:lvlJc w:val="left"/>
+      <w:pPr>
+        <w:ind w:left="720" w:hanging="360"/>
+      </w:pPr>
+      <w:rPr>
+        <w:rFonts w:ascii="Symbol" w:hAnsi="Symbol" w:hint="default"/>
+      </w:rPr>
+    </w:lvl>
+    <w:lvl w:ilvl="1" w:tplc="04090003" w:tentative="1">
+      <w:start w:val="1"/>
+      <w:numFmt w:val="bullet"/>
+      <w:lvlText w:val="o"/>
+      <w:lvlJc w:val="left"/>
+      <w:pPr>
+        <w:ind w:left="1440" w:hanging="360"/>
+      </w:pPr>
+      <w:rPr>
+        <w:rFonts w:ascii="Courier New" w:hAnsi="Courier New" w:cs="Courier New" w:hint="default"/>
+      </w:rPr>
+    </w:lvl>
+    <w:lvl w:ilvl="2" w:tplc="04090005" w:tentative="1">
+      <w:start w:val="1"/>
+      <w:numFmt w:val="bullet"/>
+      <w:lvlText w:val=""/>
+      <w:lvlJc w:val="left"/>
+      <w:pPr>
+        <w:ind w:left="2160" w:hanging="360"/>
+      </w:pPr>
+      <w:rPr>
+        <w:rFonts w:ascii="Wingdings" w:hAnsi="Wingdings" w:hint="default"/>
+      </w:rPr>
+    </w:lvl>
+    <w:lvl w:ilvl="3" w:tplc="04090001" w:tentative="1">
+      <w:start w:val="1"/>
+      <w:numFmt w:val="bullet"/>
+      <w:lvlText w:val=""/>
+      <w:lvlJc w:val="left"/>
+      <w:pPr>
+        <w:ind w:left="2880" w:hanging="360"/>
+      </w:pPr>
+      <w:rPr>
+        <w:rFonts w:ascii="Symbol" w:hAnsi="Symbol" w:hint="default"/>
+      </w:rPr>
+    </w:lvl>
+    <w:lvl w:ilvl="4" w:tplc="04090003" w:tentative="1">
+      <w:start w:val="1"/>
+      <w:numFmt w:val="bullet"/>
+      <w:lvlText w:val="o"/>
+      <w:lvlJc w:val="left"/>
+      <w:pPr>
+        <w:ind w:left="3600" w:hanging="360"/>
+      </w:pPr>
+      <w:rPr>
+        <w:rFonts w:ascii="Courier New" w:hAnsi="Courier New" w:cs="Courier New" w:hint="default"/>
+      </w:rPr>
+    </w:lvl>
+    <w:lvl w:ilvl="5" w:tplc="04090005" w:tentative="1">
+      <w:start w:val="1"/>
+      <w:numFmt w:val="bullet"/>
+      <w:lvlText w:val=""/>
+      <w:lvlJc w:val="left"/>
+      <w:pPr>
+        <w:ind w:left="4320" w:hanging="360"/>
+      </w:pPr>
+      <w:rPr>
+        <w:rFonts w:ascii="Wingdings" w:hAnsi="Wingdings" w:hint="default"/>
+      </w:rPr>
+    </w:lvl>
+    <w:lvl w:ilvl="6" w:tplc="04090001" w:tentative="1">
+      <w:start w:val="1"/>
+      <w:numFmt w:val="bullet"/>
+      <w:lvlText w:val=""/>
+      <w:lvlJc w:val="left"/>
+      <w:pPr>
+        <w:ind w:left="5040" w:hanging="360"/>
+      </w:pPr>
+      <w:rPr>
+        <w:rFonts w:ascii="Symbol" w:hAnsi="Symbol" w:hint="default"/>
+      </w:rPr>
+    </w:lvl>
+    <w:lvl w:ilvl="7" w:tplc="04090003" w:tentative="1">
+      <w:start w:val="1"/>
+      <w:numFmt w:val="bullet"/>
+      <w:lvlText w:val="o"/>
+      <w:lvlJc w:val="left"/>
+      <w:pPr>
+        <w:ind w:left="5760" w:hanging="360"/>
+      </w:pPr>
+      <w:rPr>
+        <w:rFonts w:ascii="Courier New" w:hAnsi="Courier New" w:cs="Courier New" w:hint="default"/>
+      </w:rPr>
+    </w:lvl>
+    <w:lvl w:ilvl="8" w:tplc="04090005" w:tentative="1">
+      <w:start w:val="1"/>
+      <w:numFmt w:val="bullet"/>
+      <w:lvlText w:val=""/>
+      <w:lvlJc w:val="left"/>
+      <w:pPr>
+        <w:ind w:left="6480" w:hanging="360"/>
+      </w:pPr>
+      <w:rPr>
+        <w:rFonts w:ascii="Wingdings" w:hAnsi="Wingdings" w:hint="default"/>
+      </w:rPr>
+    </w:lvl>
+  </w:abstractNum>
+  <w:abstractNum w:abstractNumId="4" w15:restartNumberingAfterBreak="0">
     <w:nsid w:val="0BC1220A"/>
     <w:multiLevelType w:val="multilevel"/>
     <w:tmpl w:val="84589E32"/>
@@ -1322,7 +2476,7 @@
       </w:rPr>
     </w:lvl>
   </w:abstractNum>
-  <w:abstractNum w:abstractNumId="4" w15:restartNumberingAfterBreak="0">
+  <w:abstractNum w:abstractNumId="5" w15:restartNumberingAfterBreak="0">
     <w:nsid w:val="0BD4059A"/>
     <w:multiLevelType w:val="hybridMultilevel"/>
     <w:tmpl w:val="3290438A"/>
@@ -1435,7 +2589,346 @@
       </w:rPr>
     </w:lvl>
   </w:abstractNum>
-  <w:abstractNum w:abstractNumId="5" w15:restartNumberingAfterBreak="0">
+  <w:abstractNum w:abstractNumId="6" w15:restartNumberingAfterBreak="0">
+    <w:nsid w:val="0ED53C8D"/>
+    <w:multiLevelType w:val="hybridMultilevel"/>
+    <w:tmpl w:val="3514B43C"/>
+    <w:lvl w:ilvl="0" w:tplc="04090001">
+      <w:start w:val="1"/>
+      <w:numFmt w:val="bullet"/>
+      <w:lvlText w:val=""/>
+      <w:lvlJc w:val="left"/>
+      <w:pPr>
+        <w:ind w:left="720" w:hanging="360"/>
+      </w:pPr>
+      <w:rPr>
+        <w:rFonts w:ascii="Symbol" w:hAnsi="Symbol" w:hint="default"/>
+      </w:rPr>
+    </w:lvl>
+    <w:lvl w:ilvl="1" w:tplc="04090003" w:tentative="1">
+      <w:start w:val="1"/>
+      <w:numFmt w:val="bullet"/>
+      <w:lvlText w:val="o"/>
+      <w:lvlJc w:val="left"/>
+      <w:pPr>
+        <w:ind w:left="1440" w:hanging="360"/>
+      </w:pPr>
+      <w:rPr>
+        <w:rFonts w:ascii="Courier New" w:hAnsi="Courier New" w:cs="Courier New" w:hint="default"/>
+      </w:rPr>
+    </w:lvl>
+    <w:lvl w:ilvl="2" w:tplc="04090005" w:tentative="1">
+      <w:start w:val="1"/>
+      <w:numFmt w:val="bullet"/>
+      <w:lvlText w:val=""/>
+      <w:lvlJc w:val="left"/>
+      <w:pPr>
+        <w:ind w:left="2160" w:hanging="360"/>
+      </w:pPr>
+      <w:rPr>
+        <w:rFonts w:ascii="Wingdings" w:hAnsi="Wingdings" w:hint="default"/>
+      </w:rPr>
+    </w:lvl>
+    <w:lvl w:ilvl="3" w:tplc="04090001" w:tentative="1">
+      <w:start w:val="1"/>
+      <w:numFmt w:val="bullet"/>
+      <w:lvlText w:val=""/>
+      <w:lvlJc w:val="left"/>
+      <w:pPr>
+        <w:ind w:left="2880" w:hanging="360"/>
+      </w:pPr>
+      <w:rPr>
+        <w:rFonts w:ascii="Symbol" w:hAnsi="Symbol" w:hint="default"/>
+      </w:rPr>
+    </w:lvl>
+    <w:lvl w:ilvl="4" w:tplc="04090003" w:tentative="1">
+      <w:start w:val="1"/>
+      <w:numFmt w:val="bullet"/>
+      <w:lvlText w:val="o"/>
+      <w:lvlJc w:val="left"/>
+      <w:pPr>
+        <w:ind w:left="3600" w:hanging="360"/>
+      </w:pPr>
+      <w:rPr>
+        <w:rFonts w:ascii="Courier New" w:hAnsi="Courier New" w:cs="Courier New" w:hint="default"/>
+      </w:rPr>
+    </w:lvl>
+    <w:lvl w:ilvl="5" w:tplc="04090005" w:tentative="1">
+      <w:start w:val="1"/>
+      <w:numFmt w:val="bullet"/>
+      <w:lvlText w:val=""/>
+      <w:lvlJc w:val="left"/>
+      <w:pPr>
+        <w:ind w:left="4320" w:hanging="360"/>
+      </w:pPr>
+      <w:rPr>
+        <w:rFonts w:ascii="Wingdings" w:hAnsi="Wingdings" w:hint="default"/>
+      </w:rPr>
+    </w:lvl>
+    <w:lvl w:ilvl="6" w:tplc="04090001" w:tentative="1">
+      <w:start w:val="1"/>
+      <w:numFmt w:val="bullet"/>
+      <w:lvlText w:val=""/>
+      <w:lvlJc w:val="left"/>
+      <w:pPr>
+        <w:ind w:left="5040" w:hanging="360"/>
+      </w:pPr>
+      <w:rPr>
+        <w:rFonts w:ascii="Symbol" w:hAnsi="Symbol" w:hint="default"/>
+      </w:rPr>
+    </w:lvl>
+    <w:lvl w:ilvl="7" w:tplc="04090003" w:tentative="1">
+      <w:start w:val="1"/>
+      <w:numFmt w:val="bullet"/>
+      <w:lvlText w:val="o"/>
+      <w:lvlJc w:val="left"/>
+      <w:pPr>
+        <w:ind w:left="5760" w:hanging="360"/>
+      </w:pPr>
+      <w:rPr>
+        <w:rFonts w:ascii="Courier New" w:hAnsi="Courier New" w:cs="Courier New" w:hint="default"/>
+      </w:rPr>
+    </w:lvl>
+    <w:lvl w:ilvl="8" w:tplc="04090005" w:tentative="1">
+      <w:start w:val="1"/>
+      <w:numFmt w:val="bullet"/>
+      <w:lvlText w:val=""/>
+      <w:lvlJc w:val="left"/>
+      <w:pPr>
+        <w:ind w:left="6480" w:hanging="360"/>
+      </w:pPr>
+      <w:rPr>
+        <w:rFonts w:ascii="Wingdings" w:hAnsi="Wingdings" w:hint="default"/>
+      </w:rPr>
+    </w:lvl>
+  </w:abstractNum>
+  <w:abstractNum w:abstractNumId="7" w15:restartNumberingAfterBreak="0">
+    <w:nsid w:val="101E1014"/>
+    <w:multiLevelType w:val="hybridMultilevel"/>
+    <w:tmpl w:val="F322077C"/>
+    <w:lvl w:ilvl="0" w:tplc="04090001">
+      <w:start w:val="1"/>
+      <w:numFmt w:val="bullet"/>
+      <w:lvlText w:val=""/>
+      <w:lvlJc w:val="left"/>
+      <w:pPr>
+        <w:ind w:left="720" w:hanging="360"/>
+      </w:pPr>
+      <w:rPr>
+        <w:rFonts w:ascii="Symbol" w:hAnsi="Symbol" w:hint="default"/>
+      </w:rPr>
+    </w:lvl>
+    <w:lvl w:ilvl="1" w:tplc="04090003" w:tentative="1">
+      <w:start w:val="1"/>
+      <w:numFmt w:val="bullet"/>
+      <w:lvlText w:val="o"/>
+      <w:lvlJc w:val="left"/>
+      <w:pPr>
+        <w:ind w:left="1440" w:hanging="360"/>
+      </w:pPr>
+      <w:rPr>
+        <w:rFonts w:ascii="Courier New" w:hAnsi="Courier New" w:cs="Courier New" w:hint="default"/>
+      </w:rPr>
+    </w:lvl>
+    <w:lvl w:ilvl="2" w:tplc="04090005" w:tentative="1">
+      <w:start w:val="1"/>
+      <w:numFmt w:val="bullet"/>
+      <w:lvlText w:val=""/>
+      <w:lvlJc w:val="left"/>
+      <w:pPr>
+        <w:ind w:left="2160" w:hanging="360"/>
+      </w:pPr>
+      <w:rPr>
+        <w:rFonts w:ascii="Wingdings" w:hAnsi="Wingdings" w:hint="default"/>
+      </w:rPr>
+    </w:lvl>
+    <w:lvl w:ilvl="3" w:tplc="04090001" w:tentative="1">
+      <w:start w:val="1"/>
+      <w:numFmt w:val="bullet"/>
+      <w:lvlText w:val=""/>
+      <w:lvlJc w:val="left"/>
+      <w:pPr>
+        <w:ind w:left="2880" w:hanging="360"/>
+      </w:pPr>
+      <w:rPr>
+        <w:rFonts w:ascii="Symbol" w:hAnsi="Symbol" w:hint="default"/>
+      </w:rPr>
+    </w:lvl>
+    <w:lvl w:ilvl="4" w:tplc="04090003" w:tentative="1">
+      <w:start w:val="1"/>
+      <w:numFmt w:val="bullet"/>
+      <w:lvlText w:val="o"/>
+      <w:lvlJc w:val="left"/>
+      <w:pPr>
+        <w:ind w:left="3600" w:hanging="360"/>
+      </w:pPr>
+      <w:rPr>
+        <w:rFonts w:ascii="Courier New" w:hAnsi="Courier New" w:cs="Courier New" w:hint="default"/>
+      </w:rPr>
+    </w:lvl>
+    <w:lvl w:ilvl="5" w:tplc="04090005" w:tentative="1">
+      <w:start w:val="1"/>
+      <w:numFmt w:val="bullet"/>
+      <w:lvlText w:val=""/>
+      <w:lvlJc w:val="left"/>
+      <w:pPr>
+        <w:ind w:left="4320" w:hanging="360"/>
+      </w:pPr>
+      <w:rPr>
+        <w:rFonts w:ascii="Wingdings" w:hAnsi="Wingdings" w:hint="default"/>
+      </w:rPr>
+    </w:lvl>
+    <w:lvl w:ilvl="6" w:tplc="04090001" w:tentative="1">
+      <w:start w:val="1"/>
+      <w:numFmt w:val="bullet"/>
+      <w:lvlText w:val=""/>
+      <w:lvlJc w:val="left"/>
+      <w:pPr>
+        <w:ind w:left="5040" w:hanging="360"/>
+      </w:pPr>
+      <w:rPr>
+        <w:rFonts w:ascii="Symbol" w:hAnsi="Symbol" w:hint="default"/>
+      </w:rPr>
+    </w:lvl>
+    <w:lvl w:ilvl="7" w:tplc="04090003" w:tentative="1">
+      <w:start w:val="1"/>
+      <w:numFmt w:val="bullet"/>
+      <w:lvlText w:val="o"/>
+      <w:lvlJc w:val="left"/>
+      <w:pPr>
+        <w:ind w:left="5760" w:hanging="360"/>
+      </w:pPr>
+      <w:rPr>
+        <w:rFonts w:ascii="Courier New" w:hAnsi="Courier New" w:cs="Courier New" w:hint="default"/>
+      </w:rPr>
+    </w:lvl>
+    <w:lvl w:ilvl="8" w:tplc="04090005" w:tentative="1">
+      <w:start w:val="1"/>
+      <w:numFmt w:val="bullet"/>
+      <w:lvlText w:val=""/>
+      <w:lvlJc w:val="left"/>
+      <w:pPr>
+        <w:ind w:left="6480" w:hanging="360"/>
+      </w:pPr>
+      <w:rPr>
+        <w:rFonts w:ascii="Wingdings" w:hAnsi="Wingdings" w:hint="default"/>
+      </w:rPr>
+    </w:lvl>
+  </w:abstractNum>
+  <w:abstractNum w:abstractNumId="8" w15:restartNumberingAfterBreak="0">
+    <w:nsid w:val="1EFB3560"/>
+    <w:multiLevelType w:val="hybridMultilevel"/>
+    <w:tmpl w:val="C0680448"/>
+    <w:lvl w:ilvl="0" w:tplc="04090001">
+      <w:start w:val="1"/>
+      <w:numFmt w:val="bullet"/>
+      <w:lvlText w:val=""/>
+      <w:lvlJc w:val="left"/>
+      <w:pPr>
+        <w:ind w:left="720" w:hanging="360"/>
+      </w:pPr>
+      <w:rPr>
+        <w:rFonts w:ascii="Symbol" w:hAnsi="Symbol" w:hint="default"/>
+      </w:rPr>
+    </w:lvl>
+    <w:lvl w:ilvl="1" w:tplc="04090003" w:tentative="1">
+      <w:start w:val="1"/>
+      <w:numFmt w:val="bullet"/>
+      <w:lvlText w:val="o"/>
+      <w:lvlJc w:val="left"/>
+      <w:pPr>
+        <w:ind w:left="1440" w:hanging="360"/>
+      </w:pPr>
+      <w:rPr>
+        <w:rFonts w:ascii="Courier New" w:hAnsi="Courier New" w:cs="Courier New" w:hint="default"/>
+      </w:rPr>
+    </w:lvl>
+    <w:lvl w:ilvl="2" w:tplc="04090005" w:tentative="1">
+      <w:start w:val="1"/>
+      <w:numFmt w:val="bullet"/>
+      <w:lvlText w:val=""/>
+      <w:lvlJc w:val="left"/>
+      <w:pPr>
+        <w:ind w:left="2160" w:hanging="360"/>
+      </w:pPr>
+      <w:rPr>
+        <w:rFonts w:ascii="Wingdings" w:hAnsi="Wingdings" w:hint="default"/>
+      </w:rPr>
+    </w:lvl>
+    <w:lvl w:ilvl="3" w:tplc="04090001" w:tentative="1">
+      <w:start w:val="1"/>
+      <w:numFmt w:val="bullet"/>
+      <w:lvlText w:val=""/>
+      <w:lvlJc w:val="left"/>
+      <w:pPr>
+        <w:ind w:left="2880" w:hanging="360"/>
+      </w:pPr>
+      <w:rPr>
+        <w:rFonts w:ascii="Symbol" w:hAnsi="Symbol" w:hint="default"/>
+      </w:rPr>
+    </w:lvl>
+    <w:lvl w:ilvl="4" w:tplc="04090003" w:tentative="1">
+      <w:start w:val="1"/>
+      <w:numFmt w:val="bullet"/>
+      <w:lvlText w:val="o"/>
+      <w:lvlJc w:val="left"/>
+      <w:pPr>
+        <w:ind w:left="3600" w:hanging="360"/>
+      </w:pPr>
+      <w:rPr>
+        <w:rFonts w:ascii="Courier New" w:hAnsi="Courier New" w:cs="Courier New" w:hint="default"/>
+      </w:rPr>
+    </w:lvl>
+    <w:lvl w:ilvl="5" w:tplc="04090005" w:tentative="1">
+      <w:start w:val="1"/>
+      <w:numFmt w:val="bullet"/>
+      <w:lvlText w:val=""/>
+      <w:lvlJc w:val="left"/>
+      <w:pPr>
+        <w:ind w:left="4320" w:hanging="360"/>
+      </w:pPr>
+      <w:rPr>
+        <w:rFonts w:ascii="Wingdings" w:hAnsi="Wingdings" w:hint="default"/>
+      </w:rPr>
+    </w:lvl>
+    <w:lvl w:ilvl="6" w:tplc="04090001" w:tentative="1">
+      <w:start w:val="1"/>
+      <w:numFmt w:val="bullet"/>
+      <w:lvlText w:val=""/>
+      <w:lvlJc w:val="left"/>
+      <w:pPr>
+        <w:ind w:left="5040" w:hanging="360"/>
+      </w:pPr>
+      <w:rPr>
+        <w:rFonts w:ascii="Symbol" w:hAnsi="Symbol" w:hint="default"/>
+      </w:rPr>
+    </w:lvl>
+    <w:lvl w:ilvl="7" w:tplc="04090003" w:tentative="1">
+      <w:start w:val="1"/>
+      <w:numFmt w:val="bullet"/>
+      <w:lvlText w:val="o"/>
+      <w:lvlJc w:val="left"/>
+      <w:pPr>
+        <w:ind w:left="5760" w:hanging="360"/>
+      </w:pPr>
+      <w:rPr>
+        <w:rFonts w:ascii="Courier New" w:hAnsi="Courier New" w:cs="Courier New" w:hint="default"/>
+      </w:rPr>
+    </w:lvl>
+    <w:lvl w:ilvl="8" w:tplc="04090005" w:tentative="1">
+      <w:start w:val="1"/>
+      <w:numFmt w:val="bullet"/>
+      <w:lvlText w:val=""/>
+      <w:lvlJc w:val="left"/>
+      <w:pPr>
+        <w:ind w:left="6480" w:hanging="360"/>
+      </w:pPr>
+      <w:rPr>
+        <w:rFonts w:ascii="Wingdings" w:hAnsi="Wingdings" w:hint="default"/>
+      </w:rPr>
+    </w:lvl>
+  </w:abstractNum>
+  <w:abstractNum w:abstractNumId="9" w15:restartNumberingAfterBreak="0">
     <w:nsid w:val="1F523825"/>
     <w:multiLevelType w:val="multilevel"/>
     <w:tmpl w:val="64BA97AC"/>
@@ -1552,7 +3045,7 @@
       </w:pPr>
     </w:lvl>
   </w:abstractNum>
-  <w:abstractNum w:abstractNumId="6" w15:restartNumberingAfterBreak="0">
+  <w:abstractNum w:abstractNumId="10" w15:restartNumberingAfterBreak="0">
     <w:nsid w:val="2013334F"/>
     <w:multiLevelType w:val="hybridMultilevel"/>
     <w:tmpl w:val="5298E342"/>
@@ -1665,7 +3158,7 @@
       </w:rPr>
     </w:lvl>
   </w:abstractNum>
-  <w:abstractNum w:abstractNumId="7" w15:restartNumberingAfterBreak="0">
+  <w:abstractNum w:abstractNumId="11" w15:restartNumberingAfterBreak="0">
     <w:nsid w:val="21223DA7"/>
     <w:multiLevelType w:val="hybridMultilevel"/>
     <w:tmpl w:val="BD7A74FA"/>
@@ -1778,7 +3271,120 @@
       </w:rPr>
     </w:lvl>
   </w:abstractNum>
-  <w:abstractNum w:abstractNumId="8" w15:restartNumberingAfterBreak="0">
+  <w:abstractNum w:abstractNumId="12" w15:restartNumberingAfterBreak="0">
+    <w:nsid w:val="228624FE"/>
+    <w:multiLevelType w:val="hybridMultilevel"/>
+    <w:tmpl w:val="D4B01354"/>
+    <w:lvl w:ilvl="0" w:tplc="04090001">
+      <w:start w:val="1"/>
+      <w:numFmt w:val="bullet"/>
+      <w:lvlText w:val=""/>
+      <w:lvlJc w:val="left"/>
+      <w:pPr>
+        <w:ind w:left="720" w:hanging="360"/>
+      </w:pPr>
+      <w:rPr>
+        <w:rFonts w:ascii="Symbol" w:hAnsi="Symbol" w:hint="default"/>
+      </w:rPr>
+    </w:lvl>
+    <w:lvl w:ilvl="1" w:tplc="04090003" w:tentative="1">
+      <w:start w:val="1"/>
+      <w:numFmt w:val="bullet"/>
+      <w:lvlText w:val="o"/>
+      <w:lvlJc w:val="left"/>
+      <w:pPr>
+        <w:ind w:left="1440" w:hanging="360"/>
+      </w:pPr>
+      <w:rPr>
+        <w:rFonts w:ascii="Courier New" w:hAnsi="Courier New" w:cs="Courier New" w:hint="default"/>
+      </w:rPr>
+    </w:lvl>
+    <w:lvl w:ilvl="2" w:tplc="04090005" w:tentative="1">
+      <w:start w:val="1"/>
+      <w:numFmt w:val="bullet"/>
+      <w:lvlText w:val=""/>
+      <w:lvlJc w:val="left"/>
+      <w:pPr>
+        <w:ind w:left="2160" w:hanging="360"/>
+      </w:pPr>
+      <w:rPr>
+        <w:rFonts w:ascii="Wingdings" w:hAnsi="Wingdings" w:hint="default"/>
+      </w:rPr>
+    </w:lvl>
+    <w:lvl w:ilvl="3" w:tplc="04090001" w:tentative="1">
+      <w:start w:val="1"/>
+      <w:numFmt w:val="bullet"/>
+      <w:lvlText w:val=""/>
+      <w:lvlJc w:val="left"/>
+      <w:pPr>
+        <w:ind w:left="2880" w:hanging="360"/>
+      </w:pPr>
+      <w:rPr>
+        <w:rFonts w:ascii="Symbol" w:hAnsi="Symbol" w:hint="default"/>
+      </w:rPr>
+    </w:lvl>
+    <w:lvl w:ilvl="4" w:tplc="04090003" w:tentative="1">
+      <w:start w:val="1"/>
+      <w:numFmt w:val="bullet"/>
+      <w:lvlText w:val="o"/>
+      <w:lvlJc w:val="left"/>
+      <w:pPr>
+        <w:ind w:left="3600" w:hanging="360"/>
+      </w:pPr>
+      <w:rPr>
+        <w:rFonts w:ascii="Courier New" w:hAnsi="Courier New" w:cs="Courier New" w:hint="default"/>
+      </w:rPr>
+    </w:lvl>
+    <w:lvl w:ilvl="5" w:tplc="04090005" w:tentative="1">
+      <w:start w:val="1"/>
+      <w:numFmt w:val="bullet"/>
+      <w:lvlText w:val=""/>
+      <w:lvlJc w:val="left"/>
+      <w:pPr>
+        <w:ind w:left="4320" w:hanging="360"/>
+      </w:pPr>
+      <w:rPr>
+        <w:rFonts w:ascii="Wingdings" w:hAnsi="Wingdings" w:hint="default"/>
+      </w:rPr>
+    </w:lvl>
+    <w:lvl w:ilvl="6" w:tplc="04090001" w:tentative="1">
+      <w:start w:val="1"/>
+      <w:numFmt w:val="bullet"/>
+      <w:lvlText w:val=""/>
+      <w:lvlJc w:val="left"/>
+      <w:pPr>
+        <w:ind w:left="5040" w:hanging="360"/>
+      </w:pPr>
+      <w:rPr>
+        <w:rFonts w:ascii="Symbol" w:hAnsi="Symbol" w:hint="default"/>
+      </w:rPr>
+    </w:lvl>
+    <w:lvl w:ilvl="7" w:tplc="04090003" w:tentative="1">
+      <w:start w:val="1"/>
+      <w:numFmt w:val="bullet"/>
+      <w:lvlText w:val="o"/>
+      <w:lvlJc w:val="left"/>
+      <w:pPr>
+        <w:ind w:left="5760" w:hanging="360"/>
+      </w:pPr>
+      <w:rPr>
+        <w:rFonts w:ascii="Courier New" w:hAnsi="Courier New" w:cs="Courier New" w:hint="default"/>
+      </w:rPr>
+    </w:lvl>
+    <w:lvl w:ilvl="8" w:tplc="04090005" w:tentative="1">
+      <w:start w:val="1"/>
+      <w:numFmt w:val="bullet"/>
+      <w:lvlText w:val=""/>
+      <w:lvlJc w:val="left"/>
+      <w:pPr>
+        <w:ind w:left="6480" w:hanging="360"/>
+      </w:pPr>
+      <w:rPr>
+        <w:rFonts w:ascii="Wingdings" w:hAnsi="Wingdings" w:hint="default"/>
+      </w:rPr>
+    </w:lvl>
+  </w:abstractNum>
+  <w:abstractNum w:abstractNumId="13" w15:restartNumberingAfterBreak="0">
     <w:nsid w:val="22BE0493"/>
     <w:multiLevelType w:val="hybridMultilevel"/>
     <w:tmpl w:val="6ACEE2AE"/>
@@ -1891,7 +3497,7 @@
       </w:rPr>
     </w:lvl>
   </w:abstractNum>
-  <w:abstractNum w:abstractNumId="9" w15:restartNumberingAfterBreak="0">
+  <w:abstractNum w:abstractNumId="14" w15:restartNumberingAfterBreak="0">
     <w:nsid w:val="2FF9243D"/>
     <w:multiLevelType w:val="multilevel"/>
     <w:tmpl w:val="CB8E940A"/>
@@ -2004,7 +3610,120 @@
       </w:pPr>
     </w:lvl>
   </w:abstractNum>
-  <w:abstractNum w:abstractNumId="10" w15:restartNumberingAfterBreak="0">
+  <w:abstractNum w:abstractNumId="15" w15:restartNumberingAfterBreak="0">
+    <w:nsid w:val="340C5F39"/>
+    <w:multiLevelType w:val="hybridMultilevel"/>
+    <w:tmpl w:val="D3142540"/>
+    <w:lvl w:ilvl="0" w:tplc="04090001">
+      <w:start w:val="1"/>
+      <w:numFmt w:val="bullet"/>
+      <w:lvlText w:val=""/>
+      <w:lvlJc w:val="left"/>
+      <w:pPr>
+        <w:ind w:left="720" w:hanging="360"/>
+      </w:pPr>
+      <w:rPr>
+        <w:rFonts w:ascii="Symbol" w:hAnsi="Symbol" w:hint="default"/>
+      </w:rPr>
+    </w:lvl>
+    <w:lvl w:ilvl="1" w:tplc="04090003" w:tentative="1">
+      <w:start w:val="1"/>
+      <w:numFmt w:val="bullet"/>
+      <w:lvlText w:val="o"/>
+      <w:lvlJc w:val="left"/>
+      <w:pPr>
+        <w:ind w:left="1440" w:hanging="360"/>
+      </w:pPr>
+      <w:rPr>
+        <w:rFonts w:ascii="Courier New" w:hAnsi="Courier New" w:cs="Courier New" w:hint="default"/>
+      </w:rPr>
+    </w:lvl>
+    <w:lvl w:ilvl="2" w:tplc="04090005" w:tentative="1">
+      <w:start w:val="1"/>
+      <w:numFmt w:val="bullet"/>
+      <w:lvlText w:val=""/>
+      <w:lvlJc w:val="left"/>
+      <w:pPr>
+        <w:ind w:left="2160" w:hanging="360"/>
+      </w:pPr>
+      <w:rPr>
+        <w:rFonts w:ascii="Wingdings" w:hAnsi="Wingdings" w:hint="default"/>
+      </w:rPr>
+    </w:lvl>
+    <w:lvl w:ilvl="3" w:tplc="04090001" w:tentative="1">
+      <w:start w:val="1"/>
+      <w:numFmt w:val="bullet"/>
+      <w:lvlText w:val=""/>
+      <w:lvlJc w:val="left"/>
+      <w:pPr>
+        <w:ind w:left="2880" w:hanging="360"/>
+      </w:pPr>
+      <w:rPr>
+        <w:rFonts w:ascii="Symbol" w:hAnsi="Symbol" w:hint="default"/>
+      </w:rPr>
+    </w:lvl>
+    <w:lvl w:ilvl="4" w:tplc="04090003" w:tentative="1">
+      <w:start w:val="1"/>
+      <w:numFmt w:val="bullet"/>
+      <w:lvlText w:val="o"/>
+      <w:lvlJc w:val="left"/>
+      <w:pPr>
+        <w:ind w:left="3600" w:hanging="360"/>
+      </w:pPr>
+      <w:rPr>
+        <w:rFonts w:ascii="Courier New" w:hAnsi="Courier New" w:cs="Courier New" w:hint="default"/>
+      </w:rPr>
+    </w:lvl>
+    <w:lvl w:ilvl="5" w:tplc="04090005" w:tentative="1">
+      <w:start w:val="1"/>
+      <w:numFmt w:val="bullet"/>
+      <w:lvlText w:val=""/>
+      <w:lvlJc w:val="left"/>
+      <w:pPr>
+        <w:ind w:left="4320" w:hanging="360"/>
+      </w:pPr>
+      <w:rPr>
+        <w:rFonts w:ascii="Wingdings" w:hAnsi="Wingdings" w:hint="default"/>
+      </w:rPr>
+    </w:lvl>
+    <w:lvl w:ilvl="6" w:tplc="04090001" w:tentative="1">
+      <w:start w:val="1"/>
+      <w:numFmt w:val="bullet"/>
+      <w:lvlText w:val=""/>
+      <w:lvlJc w:val="left"/>
+      <w:pPr>
+        <w:ind w:left="5040" w:hanging="360"/>
+      </w:pPr>
+      <w:rPr>
+        <w:rFonts w:ascii="Symbol" w:hAnsi="Symbol" w:hint="default"/>
+      </w:rPr>
+    </w:lvl>
+    <w:lvl w:ilvl="7" w:tplc="04090003" w:tentative="1">
+      <w:start w:val="1"/>
+      <w:numFmt w:val="bullet"/>
+      <w:lvlText w:val="o"/>
+      <w:lvlJc w:val="left"/>
+      <w:pPr>
+        <w:ind w:left="5760" w:hanging="360"/>
+      </w:pPr>
+      <w:rPr>
+        <w:rFonts w:ascii="Courier New" w:hAnsi="Courier New" w:cs="Courier New" w:hint="default"/>
+      </w:rPr>
+    </w:lvl>
+    <w:lvl w:ilvl="8" w:tplc="04090005" w:tentative="1">
+      <w:start w:val="1"/>
+      <w:numFmt w:val="bullet"/>
+      <w:lvlText w:val=""/>
+      <w:lvlJc w:val="left"/>
+      <w:pPr>
+        <w:ind w:left="6480" w:hanging="360"/>
+      </w:pPr>
+      <w:rPr>
+        <w:rFonts w:ascii="Wingdings" w:hAnsi="Wingdings" w:hint="default"/>
+      </w:rPr>
+    </w:lvl>
+  </w:abstractNum>
+  <w:abstractNum w:abstractNumId="16" w15:restartNumberingAfterBreak="0">
     <w:nsid w:val="36547103"/>
     <w:multiLevelType w:val="hybridMultilevel"/>
     <w:tmpl w:val="8B88612A"/>
@@ -2117,7 +3836,7 @@
       </w:rPr>
     </w:lvl>
   </w:abstractNum>
-  <w:abstractNum w:abstractNumId="11" w15:restartNumberingAfterBreak="0">
+  <w:abstractNum w:abstractNumId="17" w15:restartNumberingAfterBreak="0">
     <w:nsid w:val="36A342EF"/>
     <w:multiLevelType w:val="hybridMultilevel"/>
     <w:tmpl w:val="07E68002"/>
@@ -2230,7 +3949,7 @@
       </w:rPr>
     </w:lvl>
   </w:abstractNum>
-  <w:abstractNum w:abstractNumId="12" w15:restartNumberingAfterBreak="0">
+  <w:abstractNum w:abstractNumId="18" w15:restartNumberingAfterBreak="0">
     <w:nsid w:val="37B55C5F"/>
     <w:multiLevelType w:val="multilevel"/>
     <w:tmpl w:val="DEC01610"/>
@@ -2379,7 +4098,7 @@
       </w:rPr>
     </w:lvl>
   </w:abstractNum>
-  <w:abstractNum w:abstractNumId="13" w15:restartNumberingAfterBreak="0">
+  <w:abstractNum w:abstractNumId="19" w15:restartNumberingAfterBreak="0">
     <w:nsid w:val="3A5A3D29"/>
     <w:multiLevelType w:val="hybridMultilevel"/>
     <w:tmpl w:val="26141842"/>
@@ -2492,7 +4211,7 @@
       </w:rPr>
     </w:lvl>
   </w:abstractNum>
-  <w:abstractNum w:abstractNumId="14" w15:restartNumberingAfterBreak="0">
+  <w:abstractNum w:abstractNumId="20" w15:restartNumberingAfterBreak="0">
     <w:nsid w:val="3CCC2CE8"/>
     <w:multiLevelType w:val="hybridMultilevel"/>
     <w:tmpl w:val="1BC243FA"/>
@@ -2578,7 +4297,7 @@
       </w:pPr>
     </w:lvl>
   </w:abstractNum>
-  <w:abstractNum w:abstractNumId="15" w15:restartNumberingAfterBreak="0">
+  <w:abstractNum w:abstractNumId="21" w15:restartNumberingAfterBreak="0">
     <w:nsid w:val="48DF548A"/>
     <w:multiLevelType w:val="multilevel"/>
     <w:tmpl w:val="DE90F8B0"/>
@@ -2716,7 +4435,7 @@
       </w:rPr>
     </w:lvl>
   </w:abstractNum>
-  <w:abstractNum w:abstractNumId="16" w15:restartNumberingAfterBreak="0">
+  <w:abstractNum w:abstractNumId="22" w15:restartNumberingAfterBreak="0">
     <w:nsid w:val="50CB51E2"/>
     <w:multiLevelType w:val="hybridMultilevel"/>
     <w:tmpl w:val="368AB762"/>
@@ -2829,7 +4548,7 @@
       </w:rPr>
     </w:lvl>
   </w:abstractNum>
-  <w:abstractNum w:abstractNumId="17" w15:restartNumberingAfterBreak="0">
+  <w:abstractNum w:abstractNumId="23" w15:restartNumberingAfterBreak="0">
     <w:nsid w:val="510E490A"/>
     <w:multiLevelType w:val="multilevel"/>
     <w:tmpl w:val="827C601E"/>
@@ -2946,7 +4665,7 @@
       </w:pPr>
     </w:lvl>
   </w:abstractNum>
-  <w:abstractNum w:abstractNumId="18" w15:restartNumberingAfterBreak="0">
+  <w:abstractNum w:abstractNumId="24" w15:restartNumberingAfterBreak="0">
     <w:nsid w:val="557B21A8"/>
     <w:multiLevelType w:val="multilevel"/>
     <w:tmpl w:val="D84C8D4C"/>
@@ -3095,7 +4814,7 @@
       </w:rPr>
     </w:lvl>
   </w:abstractNum>
-  <w:abstractNum w:abstractNumId="19" w15:restartNumberingAfterBreak="0">
+  <w:abstractNum w:abstractNumId="25" w15:restartNumberingAfterBreak="0">
     <w:nsid w:val="58074FA5"/>
     <w:multiLevelType w:val="multilevel"/>
     <w:tmpl w:val="509AB566"/>
@@ -3244,7 +4963,120 @@
       </w:rPr>
     </w:lvl>
   </w:abstractNum>
-  <w:abstractNum w:abstractNumId="20" w15:restartNumberingAfterBreak="0">
+  <w:abstractNum w:abstractNumId="26" w15:restartNumberingAfterBreak="0">
+    <w:nsid w:val="5B7A1237"/>
+    <w:multiLevelType w:val="hybridMultilevel"/>
+    <w:tmpl w:val="DAFE04A0"/>
+    <w:lvl w:ilvl="0" w:tplc="04090001">
+      <w:start w:val="1"/>
+      <w:numFmt w:val="bullet"/>
+      <w:lvlText w:val=""/>
+      <w:lvlJc w:val="left"/>
+      <w:pPr>
+        <w:ind w:left="720" w:hanging="360"/>
+      </w:pPr>
+      <w:rPr>
+        <w:rFonts w:ascii="Symbol" w:hAnsi="Symbol" w:hint="default"/>
+      </w:rPr>
+    </w:lvl>
+    <w:lvl w:ilvl="1" w:tplc="04090003" w:tentative="1">
+      <w:start w:val="1"/>
+      <w:numFmt w:val="bullet"/>
+      <w:lvlText w:val="o"/>
+      <w:lvlJc w:val="left"/>
+      <w:pPr>
+        <w:ind w:left="1440" w:hanging="360"/>
+      </w:pPr>
+      <w:rPr>
+        <w:rFonts w:ascii="Courier New" w:hAnsi="Courier New" w:cs="Courier New" w:hint="default"/>
+      </w:rPr>
+    </w:lvl>
+    <w:lvl w:ilvl="2" w:tplc="04090005" w:tentative="1">
+      <w:start w:val="1"/>
+      <w:numFmt w:val="bullet"/>
+      <w:lvlText w:val=""/>
+      <w:lvlJc w:val="left"/>
+      <w:pPr>
+        <w:ind w:left="2160" w:hanging="360"/>
+      </w:pPr>
+      <w:rPr>
+        <w:rFonts w:ascii="Wingdings" w:hAnsi="Wingdings" w:hint="default"/>
+      </w:rPr>
+    </w:lvl>
+    <w:lvl w:ilvl="3" w:tplc="04090001" w:tentative="1">
+      <w:start w:val="1"/>
+      <w:numFmt w:val="bullet"/>
+      <w:lvlText w:val=""/>
+      <w:lvlJc w:val="left"/>
+      <w:pPr>
+        <w:ind w:left="2880" w:hanging="360"/>
+      </w:pPr>
+      <w:rPr>
+        <w:rFonts w:ascii="Symbol" w:hAnsi="Symbol" w:hint="default"/>
+      </w:rPr>
+    </w:lvl>
+    <w:lvl w:ilvl="4" w:tplc="04090003" w:tentative="1">
+      <w:start w:val="1"/>
+      <w:numFmt w:val="bullet"/>
+      <w:lvlText w:val="o"/>
+      <w:lvlJc w:val="left"/>
+      <w:pPr>
+        <w:ind w:left="3600" w:hanging="360"/>
+      </w:pPr>
+      <w:rPr>
+        <w:rFonts w:ascii="Courier New" w:hAnsi="Courier New" w:cs="Courier New" w:hint="default"/>
+      </w:rPr>
+    </w:lvl>
+    <w:lvl w:ilvl="5" w:tplc="04090005" w:tentative="1">
+      <w:start w:val="1"/>
+      <w:numFmt w:val="bullet"/>
+      <w:lvlText w:val=""/>
+      <w:lvlJc w:val="left"/>
+      <w:pPr>
+        <w:ind w:left="4320" w:hanging="360"/>
+      </w:pPr>
+      <w:rPr>
+        <w:rFonts w:ascii="Wingdings" w:hAnsi="Wingdings" w:hint="default"/>
+      </w:rPr>
+    </w:lvl>
+    <w:lvl w:ilvl="6" w:tplc="04090001" w:tentative="1">
+      <w:start w:val="1"/>
+      <w:numFmt w:val="bullet"/>
+      <w:lvlText w:val=""/>
+      <w:lvlJc w:val="left"/>
+      <w:pPr>
+        <w:ind w:left="5040" w:hanging="360"/>
+      </w:pPr>
+      <w:rPr>
+        <w:rFonts w:ascii="Symbol" w:hAnsi="Symbol" w:hint="default"/>
+      </w:rPr>
+    </w:lvl>
+    <w:lvl w:ilvl="7" w:tplc="04090003" w:tentative="1">
+      <w:start w:val="1"/>
+      <w:numFmt w:val="bullet"/>
+      <w:lvlText w:val="o"/>
+      <w:lvlJc w:val="left"/>
+      <w:pPr>
+        <w:ind w:left="5760" w:hanging="360"/>
+      </w:pPr>
+      <w:rPr>
+        <w:rFonts w:ascii="Courier New" w:hAnsi="Courier New" w:cs="Courier New" w:hint="default"/>
+      </w:rPr>
+    </w:lvl>
+    <w:lvl w:ilvl="8" w:tplc="04090005" w:tentative="1">
+      <w:start w:val="1"/>
+      <w:numFmt w:val="bullet"/>
+      <w:lvlText w:val=""/>
+      <w:lvlJc w:val="left"/>
+      <w:pPr>
+        <w:ind w:left="6480" w:hanging="360"/>
+      </w:pPr>
+      <w:rPr>
+        <w:rFonts w:ascii="Wingdings" w:hAnsi="Wingdings" w:hint="default"/>
+      </w:rPr>
+    </w:lvl>
+  </w:abstractNum>
+  <w:abstractNum w:abstractNumId="27" w15:restartNumberingAfterBreak="0">
     <w:nsid w:val="5ED71624"/>
     <w:multiLevelType w:val="multilevel"/>
     <w:tmpl w:val="2A8A514E"/>
@@ -3361,7 +5193,120 @@
       </w:pPr>
     </w:lvl>
   </w:abstractNum>
-  <w:abstractNum w:abstractNumId="21" w15:restartNumberingAfterBreak="0">
+  <w:abstractNum w:abstractNumId="28" w15:restartNumberingAfterBreak="0">
+    <w:nsid w:val="64124DFD"/>
+    <w:multiLevelType w:val="hybridMultilevel"/>
+    <w:tmpl w:val="66D0B646"/>
+    <w:lvl w:ilvl="0" w:tplc="04090001">
+      <w:start w:val="1"/>
+      <w:numFmt w:val="bullet"/>
+      <w:lvlText w:val=""/>
+      <w:lvlJc w:val="left"/>
+      <w:pPr>
+        <w:ind w:left="720" w:hanging="360"/>
+      </w:pPr>
+      <w:rPr>
+        <w:rFonts w:ascii="Symbol" w:hAnsi="Symbol" w:hint="default"/>
+      </w:rPr>
+    </w:lvl>
+    <w:lvl w:ilvl="1" w:tplc="04090003" w:tentative="1">
+      <w:start w:val="1"/>
+      <w:numFmt w:val="bullet"/>
+      <w:lvlText w:val="o"/>
+      <w:lvlJc w:val="left"/>
+      <w:pPr>
+        <w:ind w:left="1440" w:hanging="360"/>
+      </w:pPr>
+      <w:rPr>
+        <w:rFonts w:ascii="Courier New" w:hAnsi="Courier New" w:cs="Courier New" w:hint="default"/>
+      </w:rPr>
+    </w:lvl>
+    <w:lvl w:ilvl="2" w:tplc="04090005" w:tentative="1">
+      <w:start w:val="1"/>
+      <w:numFmt w:val="bullet"/>
+      <w:lvlText w:val=""/>
+      <w:lvlJc w:val="left"/>
+      <w:pPr>
+        <w:ind w:left="2160" w:hanging="360"/>
+      </w:pPr>
+      <w:rPr>
+        <w:rFonts w:ascii="Wingdings" w:hAnsi="Wingdings" w:hint="default"/>
+      </w:rPr>
+    </w:lvl>
+    <w:lvl w:ilvl="3" w:tplc="04090001" w:tentative="1">
+      <w:start w:val="1"/>
+      <w:numFmt w:val="bullet"/>
+      <w:lvlText w:val=""/>
+      <w:lvlJc w:val="left"/>
+      <w:pPr>
+        <w:ind w:left="2880" w:hanging="360"/>
+      </w:pPr>
+      <w:rPr>
+        <w:rFonts w:ascii="Symbol" w:hAnsi="Symbol" w:hint="default"/>
+      </w:rPr>
+    </w:lvl>
+    <w:lvl w:ilvl="4" w:tplc="04090003" w:tentative="1">
+      <w:start w:val="1"/>
+      <w:numFmt w:val="bullet"/>
+      <w:lvlText w:val="o"/>
+      <w:lvlJc w:val="left"/>
+      <w:pPr>
+        <w:ind w:left="3600" w:hanging="360"/>
+      </w:pPr>
+      <w:rPr>
+        <w:rFonts w:ascii="Courier New" w:hAnsi="Courier New" w:cs="Courier New" w:hint="default"/>
+      </w:rPr>
+    </w:lvl>
+    <w:lvl w:ilvl="5" w:tplc="04090005" w:tentative="1">
+      <w:start w:val="1"/>
+      <w:numFmt w:val="bullet"/>
+      <w:lvlText w:val=""/>
+      <w:lvlJc w:val="left"/>
+      <w:pPr>
+        <w:ind w:left="4320" w:hanging="360"/>
+      </w:pPr>
+      <w:rPr>
+        <w:rFonts w:ascii="Wingdings" w:hAnsi="Wingdings" w:hint="default"/>
+      </w:rPr>
+    </w:lvl>
+    <w:lvl w:ilvl="6" w:tplc="04090001" w:tentative="1">
+      <w:start w:val="1"/>
+      <w:numFmt w:val="bullet"/>
+      <w:lvlText w:val=""/>
+      <w:lvlJc w:val="left"/>
+      <w:pPr>
+        <w:ind w:left="5040" w:hanging="360"/>
+      </w:pPr>
+      <w:rPr>
+        <w:rFonts w:ascii="Symbol" w:hAnsi="Symbol" w:hint="default"/>
+      </w:rPr>
+    </w:lvl>
+    <w:lvl w:ilvl="7" w:tplc="04090003" w:tentative="1">
+      <w:start w:val="1"/>
+      <w:numFmt w:val="bullet"/>
+      <w:lvlText w:val="o"/>
+      <w:lvlJc w:val="left"/>
+      <w:pPr>
+        <w:ind w:left="5760" w:hanging="360"/>
+      </w:pPr>
+      <w:rPr>
+        <w:rFonts w:ascii="Courier New" w:hAnsi="Courier New" w:cs="Courier New" w:hint="default"/>
+      </w:rPr>
+    </w:lvl>
+    <w:lvl w:ilvl="8" w:tplc="04090005" w:tentative="1">
+      <w:start w:val="1"/>
+      <w:numFmt w:val="bullet"/>
+      <w:lvlText w:val=""/>
+      <w:lvlJc w:val="left"/>
+      <w:pPr>
+        <w:ind w:left="6480" w:hanging="360"/>
+      </w:pPr>
+      <w:rPr>
+        <w:rFonts w:ascii="Wingdings" w:hAnsi="Wingdings" w:hint="default"/>
+      </w:rPr>
+    </w:lvl>
+  </w:abstractNum>
+  <w:abstractNum w:abstractNumId="29" w15:restartNumberingAfterBreak="0">
     <w:nsid w:val="649F78F2"/>
     <w:multiLevelType w:val="hybridMultilevel"/>
     <w:tmpl w:val="6ACEF3CE"/>
@@ -3474,7 +5419,7 @@
       </w:rPr>
     </w:lvl>
   </w:abstractNum>
-  <w:abstractNum w:abstractNumId="22" w15:restartNumberingAfterBreak="0">
+  <w:abstractNum w:abstractNumId="30" w15:restartNumberingAfterBreak="0">
     <w:nsid w:val="66047616"/>
     <w:multiLevelType w:val="multilevel"/>
     <w:tmpl w:val="64DE04DC"/>
@@ -3623,7 +5568,7 @@
       </w:rPr>
     </w:lvl>
   </w:abstractNum>
-  <w:abstractNum w:abstractNumId="23" w15:restartNumberingAfterBreak="0">
+  <w:abstractNum w:abstractNumId="31" w15:restartNumberingAfterBreak="0">
     <w:nsid w:val="6B8177FD"/>
     <w:multiLevelType w:val="hybridMultilevel"/>
     <w:tmpl w:val="F9000EBA"/>
@@ -3736,7 +5681,7 @@
       </w:rPr>
     </w:lvl>
   </w:abstractNum>
-  <w:abstractNum w:abstractNumId="24" w15:restartNumberingAfterBreak="0">
+  <w:abstractNum w:abstractNumId="32" w15:restartNumberingAfterBreak="0">
     <w:nsid w:val="6C53053C"/>
     <w:multiLevelType w:val="multilevel"/>
     <w:tmpl w:val="0409001D"/>
@@ -3822,7 +5767,7 @@
       </w:pPr>
     </w:lvl>
   </w:abstractNum>
-  <w:abstractNum w:abstractNumId="25" w15:restartNumberingAfterBreak="0">
+  <w:abstractNum w:abstractNumId="33" w15:restartNumberingAfterBreak="0">
     <w:nsid w:val="6DA63EBC"/>
     <w:multiLevelType w:val="multilevel"/>
     <w:tmpl w:val="D04EB668"/>
@@ -3971,7 +5916,233 @@
       </w:rPr>
     </w:lvl>
   </w:abstractNum>
-  <w:abstractNum w:abstractNumId="26" w15:restartNumberingAfterBreak="0">
+  <w:abstractNum w:abstractNumId="34" w15:restartNumberingAfterBreak="0">
+    <w:nsid w:val="72836CD4"/>
+    <w:multiLevelType w:val="hybridMultilevel"/>
+    <w:tmpl w:val="7F6AAAEC"/>
+    <w:lvl w:ilvl="0" w:tplc="04090001">
+      <w:start w:val="1"/>
+      <w:numFmt w:val="bullet"/>
+      <w:lvlText w:val=""/>
+      <w:lvlJc w:val="left"/>
+      <w:pPr>
+        <w:ind w:left="720" w:hanging="360"/>
+      </w:pPr>
+      <w:rPr>
+        <w:rFonts w:ascii="Symbol" w:hAnsi="Symbol" w:hint="default"/>
+      </w:rPr>
+    </w:lvl>
+    <w:lvl w:ilvl="1" w:tplc="04090003" w:tentative="1">
+      <w:start w:val="1"/>
+      <w:numFmt w:val="bullet"/>
+      <w:lvlText w:val="o"/>
+      <w:lvlJc w:val="left"/>
+      <w:pPr>
+        <w:ind w:left="1440" w:hanging="360"/>
+      </w:pPr>
+      <w:rPr>
+        <w:rFonts w:ascii="Courier New" w:hAnsi="Courier New" w:cs="Courier New" w:hint="default"/>
+      </w:rPr>
+    </w:lvl>
+    <w:lvl w:ilvl="2" w:tplc="04090005" w:tentative="1">
+      <w:start w:val="1"/>
+      <w:numFmt w:val="bullet"/>
+      <w:lvlText w:val=""/>
+      <w:lvlJc w:val="left"/>
+      <w:pPr>
+        <w:ind w:left="2160" w:hanging="360"/>
+      </w:pPr>
+      <w:rPr>
+        <w:rFonts w:ascii="Wingdings" w:hAnsi="Wingdings" w:hint="default"/>
+      </w:rPr>
+    </w:lvl>
+    <w:lvl w:ilvl="3" w:tplc="04090001" w:tentative="1">
+      <w:start w:val="1"/>
+      <w:numFmt w:val="bullet"/>
+      <w:lvlText w:val=""/>
+      <w:lvlJc w:val="left"/>
+      <w:pPr>
+        <w:ind w:left="2880" w:hanging="360"/>
+      </w:pPr>
+      <w:rPr>
+        <w:rFonts w:ascii="Symbol" w:hAnsi="Symbol" w:hint="default"/>
+      </w:rPr>
+    </w:lvl>
+    <w:lvl w:ilvl="4" w:tplc="04090003" w:tentative="1">
+      <w:start w:val="1"/>
+      <w:numFmt w:val="bullet"/>
+      <w:lvlText w:val="o"/>
+      <w:lvlJc w:val="left"/>
+      <w:pPr>
+        <w:ind w:left="3600" w:hanging="360"/>
+      </w:pPr>
+      <w:rPr>
+        <w:rFonts w:ascii="Courier New" w:hAnsi="Courier New" w:cs="Courier New" w:hint="default"/>
+      </w:rPr>
+    </w:lvl>
+    <w:lvl w:ilvl="5" w:tplc="04090005" w:tentative="1">
+      <w:start w:val="1"/>
+      <w:numFmt w:val="bullet"/>
+      <w:lvlText w:val=""/>
+      <w:lvlJc w:val="left"/>
+      <w:pPr>
+        <w:ind w:left="4320" w:hanging="360"/>
+      </w:pPr>
+      <w:rPr>
+        <w:rFonts w:ascii="Wingdings" w:hAnsi="Wingdings" w:hint="default"/>
+      </w:rPr>
+    </w:lvl>
+    <w:lvl w:ilvl="6" w:tplc="04090001" w:tentative="1">
+      <w:start w:val="1"/>
+      <w:numFmt w:val="bullet"/>
+      <w:lvlText w:val=""/>
+      <w:lvlJc w:val="left"/>
+      <w:pPr>
+        <w:ind w:left="5040" w:hanging="360"/>
+      </w:pPr>
+      <w:rPr>
+        <w:rFonts w:ascii="Symbol" w:hAnsi="Symbol" w:hint="default"/>
+      </w:rPr>
+    </w:lvl>
+    <w:lvl w:ilvl="7" w:tplc="04090003" w:tentative="1">
+      <w:start w:val="1"/>
+      <w:numFmt w:val="bullet"/>
+      <w:lvlText w:val="o"/>
+      <w:lvlJc w:val="left"/>
+      <w:pPr>
+        <w:ind w:left="5760" w:hanging="360"/>
+      </w:pPr>
+      <w:rPr>
+        <w:rFonts w:ascii="Courier New" w:hAnsi="Courier New" w:cs="Courier New" w:hint="default"/>
+      </w:rPr>
+    </w:lvl>
+    <w:lvl w:ilvl="8" w:tplc="04090005" w:tentative="1">
+      <w:start w:val="1"/>
+      <w:numFmt w:val="bullet"/>
+      <w:lvlText w:val=""/>
+      <w:lvlJc w:val="left"/>
+      <w:pPr>
+        <w:ind w:left="6480" w:hanging="360"/>
+      </w:pPr>
+      <w:rPr>
+        <w:rFonts w:ascii="Wingdings" w:hAnsi="Wingdings" w:hint="default"/>
+      </w:rPr>
+    </w:lvl>
+  </w:abstractNum>
+  <w:abstractNum w:abstractNumId="35" w15:restartNumberingAfterBreak="0">
+    <w:nsid w:val="76100998"/>
+    <w:multiLevelType w:val="hybridMultilevel"/>
+    <w:tmpl w:val="710EC96A"/>
+    <w:lvl w:ilvl="0" w:tplc="04090001">
+      <w:start w:val="1"/>
+      <w:numFmt w:val="bullet"/>
+      <w:lvlText w:val=""/>
+      <w:lvlJc w:val="left"/>
+      <w:pPr>
+        <w:ind w:left="720" w:hanging="360"/>
+      </w:pPr>
+      <w:rPr>
+        <w:rFonts w:ascii="Symbol" w:hAnsi="Symbol" w:hint="default"/>
+      </w:rPr>
+    </w:lvl>
+    <w:lvl w:ilvl="1" w:tplc="04090003" w:tentative="1">
+      <w:start w:val="1"/>
+      <w:numFmt w:val="bullet"/>
+      <w:lvlText w:val="o"/>
+      <w:lvlJc w:val="left"/>
+      <w:pPr>
+        <w:ind w:left="1440" w:hanging="360"/>
+      </w:pPr>
+      <w:rPr>
+        <w:rFonts w:ascii="Courier New" w:hAnsi="Courier New" w:cs="Courier New" w:hint="default"/>
+      </w:rPr>
+    </w:lvl>
+    <w:lvl w:ilvl="2" w:tplc="04090005" w:tentative="1">
+      <w:start w:val="1"/>
+      <w:numFmt w:val="bullet"/>
+      <w:lvlText w:val=""/>
+      <w:lvlJc w:val="left"/>
+      <w:pPr>
+        <w:ind w:left="2160" w:hanging="360"/>
+      </w:pPr>
+      <w:rPr>
+        <w:rFonts w:ascii="Wingdings" w:hAnsi="Wingdings" w:hint="default"/>
+      </w:rPr>
+    </w:lvl>
+    <w:lvl w:ilvl="3" w:tplc="04090001" w:tentative="1">
+      <w:start w:val="1"/>
+      <w:numFmt w:val="bullet"/>
+      <w:lvlText w:val=""/>
+      <w:lvlJc w:val="left"/>
+      <w:pPr>
+        <w:ind w:left="2880" w:hanging="360"/>
+      </w:pPr>
+      <w:rPr>
+        <w:rFonts w:ascii="Symbol" w:hAnsi="Symbol" w:hint="default"/>
+      </w:rPr>
+    </w:lvl>
+    <w:lvl w:ilvl="4" w:tplc="04090003" w:tentative="1">
+      <w:start w:val="1"/>
+      <w:numFmt w:val="bullet"/>
+      <w:lvlText w:val="o"/>
+      <w:lvlJc w:val="left"/>
+      <w:pPr>
+        <w:ind w:left="3600" w:hanging="360"/>
+      </w:pPr>
+      <w:rPr>
+        <w:rFonts w:ascii="Courier New" w:hAnsi="Courier New" w:cs="Courier New" w:hint="default"/>
+      </w:rPr>
+    </w:lvl>
+    <w:lvl w:ilvl="5" w:tplc="04090005" w:tentative="1">
+      <w:start w:val="1"/>
+      <w:numFmt w:val="bullet"/>
+      <w:lvlText w:val=""/>
+      <w:lvlJc w:val="left"/>
+      <w:pPr>
+        <w:ind w:left="4320" w:hanging="360"/>
+      </w:pPr>
+      <w:rPr>
+        <w:rFonts w:ascii="Wingdings" w:hAnsi="Wingdings" w:hint="default"/>
+      </w:rPr>
+    </w:lvl>
+    <w:lvl w:ilvl="6" w:tplc="04090001" w:tentative="1">
+      <w:start w:val="1"/>
+      <w:numFmt w:val="bullet"/>
+      <w:lvlText w:val=""/>
+      <w:lvlJc w:val="left"/>
+      <w:pPr>
+        <w:ind w:left="5040" w:hanging="360"/>
+      </w:pPr>
+      <w:rPr>
+        <w:rFonts w:ascii="Symbol" w:hAnsi="Symbol" w:hint="default"/>
+      </w:rPr>
+    </w:lvl>
+    <w:lvl w:ilvl="7" w:tplc="04090003" w:tentative="1">
+      <w:start w:val="1"/>
+      <w:numFmt w:val="bullet"/>
+      <w:lvlText w:val="o"/>
+      <w:lvlJc w:val="left"/>
+      <w:pPr>
+        <w:ind w:left="5760" w:hanging="360"/>
+      </w:pPr>
+      <w:rPr>
+        <w:rFonts w:ascii="Courier New" w:hAnsi="Courier New" w:cs="Courier New" w:hint="default"/>
+      </w:rPr>
+    </w:lvl>
+    <w:lvl w:ilvl="8" w:tplc="04090005" w:tentative="1">
+      <w:start w:val="1"/>
+      <w:numFmt w:val="bullet"/>
+      <w:lvlText w:val=""/>
+      <w:lvlJc w:val="left"/>
+      <w:pPr>
+        <w:ind w:left="6480" w:hanging="360"/>
+      </w:pPr>
+      <w:rPr>
+        <w:rFonts w:ascii="Wingdings" w:hAnsi="Wingdings" w:hint="default"/>
+      </w:rPr>
+    </w:lvl>
+  </w:abstractNum>
+  <w:abstractNum w:abstractNumId="36" w15:restartNumberingAfterBreak="0">
     <w:nsid w:val="7A914E35"/>
     <w:multiLevelType w:val="multilevel"/>
     <w:tmpl w:val="0768836C"/>
@@ -4120,7 +6291,7 @@
       </w:rPr>
     </w:lvl>
   </w:abstractNum>
-  <w:abstractNum w:abstractNumId="27" w15:restartNumberingAfterBreak="0">
+  <w:abstractNum w:abstractNumId="37" w15:restartNumberingAfterBreak="0">
     <w:nsid w:val="7BC50F5C"/>
     <w:multiLevelType w:val="hybridMultilevel"/>
     <w:tmpl w:val="D9B23344"/>
@@ -4233,7 +6404,7 @@
       </w:rPr>
     </w:lvl>
   </w:abstractNum>
-  <w:abstractNum w:abstractNumId="28" w15:restartNumberingAfterBreak="0">
+  <w:abstractNum w:abstractNumId="38" w15:restartNumberingAfterBreak="0">
     <w:nsid w:val="7BD037B6"/>
     <w:multiLevelType w:val="multilevel"/>
     <w:tmpl w:val="DCDECE4C"/>
@@ -4346,7 +6517,7 @@
       </w:pPr>
     </w:lvl>
   </w:abstractNum>
-  <w:abstractNum w:abstractNumId="29" w15:restartNumberingAfterBreak="0">
+  <w:abstractNum w:abstractNumId="39" w15:restartNumberingAfterBreak="0">
     <w:nsid w:val="7E374A98"/>
     <w:multiLevelType w:val="hybridMultilevel"/>
     <w:tmpl w:val="DB0C0ADE"/>
@@ -4459,7 +6630,120 @@
       </w:rPr>
     </w:lvl>
   </w:abstractNum>
-  <w:abstractNum w:abstractNumId="30" w15:restartNumberingAfterBreak="0">
+  <w:abstractNum w:abstractNumId="40" w15:restartNumberingAfterBreak="0">
+    <w:nsid w:val="7E584949"/>
+    <w:multiLevelType w:val="hybridMultilevel"/>
+    <w:tmpl w:val="50EE2470"/>
+    <w:lvl w:ilvl="0" w:tplc="04090001">
+      <w:start w:val="1"/>
+      <w:numFmt w:val="bullet"/>
+      <w:lvlText w:val=""/>
+      <w:lvlJc w:val="left"/>
+      <w:pPr>
+        <w:ind w:left="720" w:hanging="360"/>
+      </w:pPr>
+      <w:rPr>
+        <w:rFonts w:ascii="Symbol" w:hAnsi="Symbol" w:hint="default"/>
+      </w:rPr>
+    </w:lvl>
+    <w:lvl w:ilvl="1" w:tplc="04090003" w:tentative="1">
+      <w:start w:val="1"/>
+      <w:numFmt w:val="bullet"/>
+      <w:lvlText w:val="o"/>
+      <w:lvlJc w:val="left"/>
+      <w:pPr>
+        <w:ind w:left="1440" w:hanging="360"/>
+      </w:pPr>
+      <w:rPr>
+        <w:rFonts w:ascii="Courier New" w:hAnsi="Courier New" w:cs="Courier New" w:hint="default"/>
+      </w:rPr>
+    </w:lvl>
+    <w:lvl w:ilvl="2" w:tplc="04090005" w:tentative="1">
+      <w:start w:val="1"/>
+      <w:numFmt w:val="bullet"/>
+      <w:lvlText w:val=""/>
+      <w:lvlJc w:val="left"/>
+      <w:pPr>
+        <w:ind w:left="2160" w:hanging="360"/>
+      </w:pPr>
+      <w:rPr>
+        <w:rFonts w:ascii="Wingdings" w:hAnsi="Wingdings" w:hint="default"/>
+      </w:rPr>
+    </w:lvl>
+    <w:lvl w:ilvl="3" w:tplc="04090001" w:tentative="1">
+      <w:start w:val="1"/>
+      <w:numFmt w:val="bullet"/>
+      <w:lvlText w:val=""/>
+      <w:lvlJc w:val="left"/>
+      <w:pPr>
+        <w:ind w:left="2880" w:hanging="360"/>
+      </w:pPr>
+      <w:rPr>
+        <w:rFonts w:ascii="Symbol" w:hAnsi="Symbol" w:hint="default"/>
+      </w:rPr>
+    </w:lvl>
+    <w:lvl w:ilvl="4" w:tplc="04090003" w:tentative="1">
+      <w:start w:val="1"/>
+      <w:numFmt w:val="bullet"/>
+      <w:lvlText w:val="o"/>
+      <w:lvlJc w:val="left"/>
+      <w:pPr>
+        <w:ind w:left="3600" w:hanging="360"/>
+      </w:pPr>
+      <w:rPr>
+        <w:rFonts w:ascii="Courier New" w:hAnsi="Courier New" w:cs="Courier New" w:hint="default"/>
+      </w:rPr>
+    </w:lvl>
+    <w:lvl w:ilvl="5" w:tplc="04090005" w:tentative="1">
+      <w:start w:val="1"/>
+      <w:numFmt w:val="bullet"/>
+      <w:lvlText w:val=""/>
+      <w:lvlJc w:val="left"/>
+      <w:pPr>
+        <w:ind w:left="4320" w:hanging="360"/>
+      </w:pPr>
+      <w:rPr>
+        <w:rFonts w:ascii="Wingdings" w:hAnsi="Wingdings" w:hint="default"/>
+      </w:rPr>
+    </w:lvl>
+    <w:lvl w:ilvl="6" w:tplc="04090001" w:tentative="1">
+      <w:start w:val="1"/>
+      <w:numFmt w:val="bullet"/>
+      <w:lvlText w:val=""/>
+      <w:lvlJc w:val="left"/>
+      <w:pPr>
+        <w:ind w:left="5040" w:hanging="360"/>
+      </w:pPr>
+      <w:rPr>
+        <w:rFonts w:ascii="Symbol" w:hAnsi="Symbol" w:hint="default"/>
+      </w:rPr>
+    </w:lvl>
+    <w:lvl w:ilvl="7" w:tplc="04090003" w:tentative="1">
+      <w:start w:val="1"/>
+      <w:numFmt w:val="bullet"/>
+      <w:lvlText w:val="o"/>
+      <w:lvlJc w:val="left"/>
+      <w:pPr>
+        <w:ind w:left="5760" w:hanging="360"/>
+      </w:pPr>
+      <w:rPr>
+        <w:rFonts w:ascii="Courier New" w:hAnsi="Courier New" w:cs="Courier New" w:hint="default"/>
+      </w:rPr>
+    </w:lvl>
+    <w:lvl w:ilvl="8" w:tplc="04090005" w:tentative="1">
+      <w:start w:val="1"/>
+      <w:numFmt w:val="bullet"/>
+      <w:lvlText w:val=""/>
+      <w:lvlJc w:val="left"/>
+      <w:pPr>
+        <w:ind w:left="6480" w:hanging="360"/>
+      </w:pPr>
+      <w:rPr>
+        <w:rFonts w:ascii="Wingdings" w:hAnsi="Wingdings" w:hint="default"/>
+      </w:rPr>
+    </w:lvl>
+  </w:abstractNum>
+  <w:abstractNum w:abstractNumId="41" w15:restartNumberingAfterBreak="0">
     <w:nsid w:val="7FA77BD4"/>
     <w:multiLevelType w:val="multilevel"/>
     <w:tmpl w:val="9A38F7CE"/>
@@ -4576,98 +6860,247 @@
       </w:pPr>
     </w:lvl>
   </w:abstractNum>
+  <w:abstractNum w:abstractNumId="42" w15:restartNumberingAfterBreak="0">
+    <w:nsid w:val="7FA9510B"/>
+    <w:multiLevelType w:val="hybridMultilevel"/>
+    <w:tmpl w:val="A1D84314"/>
+    <w:lvl w:ilvl="0" w:tplc="04090001">
+      <w:start w:val="1"/>
+      <w:numFmt w:val="bullet"/>
+      <w:lvlText w:val=""/>
+      <w:lvlJc w:val="left"/>
+      <w:pPr>
+        <w:ind w:left="720" w:hanging="360"/>
+      </w:pPr>
+      <w:rPr>
+        <w:rFonts w:ascii="Symbol" w:hAnsi="Symbol" w:hint="default"/>
+      </w:rPr>
+    </w:lvl>
+    <w:lvl w:ilvl="1" w:tplc="04090003" w:tentative="1">
+      <w:start w:val="1"/>
+      <w:numFmt w:val="bullet"/>
+      <w:lvlText w:val="o"/>
+      <w:lvlJc w:val="left"/>
+      <w:pPr>
+        <w:ind w:left="1440" w:hanging="360"/>
+      </w:pPr>
+      <w:rPr>
+        <w:rFonts w:ascii="Courier New" w:hAnsi="Courier New" w:cs="Courier New" w:hint="default"/>
+      </w:rPr>
+    </w:lvl>
+    <w:lvl w:ilvl="2" w:tplc="04090005" w:tentative="1">
+      <w:start w:val="1"/>
+      <w:numFmt w:val="bullet"/>
+      <w:lvlText w:val=""/>
+      <w:lvlJc w:val="left"/>
+      <w:pPr>
+        <w:ind w:left="2160" w:hanging="360"/>
+      </w:pPr>
+      <w:rPr>
+        <w:rFonts w:ascii="Wingdings" w:hAnsi="Wingdings" w:hint="default"/>
+      </w:rPr>
+    </w:lvl>
+    <w:lvl w:ilvl="3" w:tplc="04090001" w:tentative="1">
+      <w:start w:val="1"/>
+      <w:numFmt w:val="bullet"/>
+      <w:lvlText w:val=""/>
+      <w:lvlJc w:val="left"/>
+      <w:pPr>
+        <w:ind w:left="2880" w:hanging="360"/>
+      </w:pPr>
+      <w:rPr>
+        <w:rFonts w:ascii="Symbol" w:hAnsi="Symbol" w:hint="default"/>
+      </w:rPr>
+    </w:lvl>
+    <w:lvl w:ilvl="4" w:tplc="04090003" w:tentative="1">
+      <w:start w:val="1"/>
+      <w:numFmt w:val="bullet"/>
+      <w:lvlText w:val="o"/>
+      <w:lvlJc w:val="left"/>
+      <w:pPr>
+        <w:ind w:left="3600" w:hanging="360"/>
+      </w:pPr>
+      <w:rPr>
+        <w:rFonts w:ascii="Courier New" w:hAnsi="Courier New" w:cs="Courier New" w:hint="default"/>
+      </w:rPr>
+    </w:lvl>
+    <w:lvl w:ilvl="5" w:tplc="04090005" w:tentative="1">
+      <w:start w:val="1"/>
+      <w:numFmt w:val="bullet"/>
+      <w:lvlText w:val=""/>
+      <w:lvlJc w:val="left"/>
+      <w:pPr>
+        <w:ind w:left="4320" w:hanging="360"/>
+      </w:pPr>
+      <w:rPr>
+        <w:rFonts w:ascii="Wingdings" w:hAnsi="Wingdings" w:hint="default"/>
+      </w:rPr>
+    </w:lvl>
+    <w:lvl w:ilvl="6" w:tplc="04090001" w:tentative="1">
+      <w:start w:val="1"/>
+      <w:numFmt w:val="bullet"/>
+      <w:lvlText w:val=""/>
+      <w:lvlJc w:val="left"/>
+      <w:pPr>
+        <w:ind w:left="5040" w:hanging="360"/>
+      </w:pPr>
+      <w:rPr>
+        <w:rFonts w:ascii="Symbol" w:hAnsi="Symbol" w:hint="default"/>
+      </w:rPr>
+    </w:lvl>
+    <w:lvl w:ilvl="7" w:tplc="04090003" w:tentative="1">
+      <w:start w:val="1"/>
+      <w:numFmt w:val="bullet"/>
+      <w:lvlText w:val="o"/>
+      <w:lvlJc w:val="left"/>
+      <w:pPr>
+        <w:ind w:left="5760" w:hanging="360"/>
+      </w:pPr>
+      <w:rPr>
+        <w:rFonts w:ascii="Courier New" w:hAnsi="Courier New" w:cs="Courier New" w:hint="default"/>
+      </w:rPr>
+    </w:lvl>
+    <w:lvl w:ilvl="8" w:tplc="04090005" w:tentative="1">
+      <w:start w:val="1"/>
+      <w:numFmt w:val="bullet"/>
+      <w:lvlText w:val=""/>
+      <w:lvlJc w:val="left"/>
+      <w:pPr>
+        <w:ind w:left="6480" w:hanging="360"/>
+      </w:pPr>
+      <w:rPr>
+        <w:rFonts w:ascii="Wingdings" w:hAnsi="Wingdings" w:hint="default"/>
+      </w:rPr>
+    </w:lvl>
+  </w:abstractNum>
   <w:num w:numId="1" w16cid:durableId="1585914580">
-    <w:abstractNumId w:val="3"/>
+    <w:abstractNumId w:val="4"/>
   </w:num>
   <w:num w:numId="2" w16cid:durableId="2085495234">
-    <w:abstractNumId w:val="15"/>
+    <w:abstractNumId w:val="21"/>
   </w:num>
   <w:num w:numId="3" w16cid:durableId="199098527">
-    <w:abstractNumId w:val="5"/>
+    <w:abstractNumId w:val="9"/>
   </w:num>
   <w:num w:numId="4" w16cid:durableId="860972517">
+    <w:abstractNumId w:val="41"/>
+  </w:num>
+  <w:num w:numId="5" w16cid:durableId="1245382851">
+    <w:abstractNumId w:val="27"/>
+  </w:num>
+  <w:num w:numId="6" w16cid:durableId="1758675041">
+    <w:abstractNumId w:val="23"/>
+  </w:num>
+  <w:num w:numId="7" w16cid:durableId="56247709">
     <w:abstractNumId w:val="30"/>
   </w:num>
-  <w:num w:numId="5" w16cid:durableId="1245382851">
-    <w:abstractNumId w:val="20"/>
-  </w:num>
-  <w:num w:numId="6" w16cid:durableId="1758675041">
-    <w:abstractNumId w:val="17"/>
-  </w:num>
-  <w:num w:numId="7" w16cid:durableId="56247709">
-    <w:abstractNumId w:val="22"/>
-  </w:num>
   <w:num w:numId="8" w16cid:durableId="1165975295">
-    <w:abstractNumId w:val="19"/>
+    <w:abstractNumId w:val="25"/>
   </w:num>
   <w:num w:numId="9" w16cid:durableId="677737302">
-    <w:abstractNumId w:val="26"/>
+    <w:abstractNumId w:val="36"/>
   </w:num>
   <w:num w:numId="10" w16cid:durableId="872351428">
-    <w:abstractNumId w:val="25"/>
+    <w:abstractNumId w:val="33"/>
   </w:num>
   <w:num w:numId="11" w16cid:durableId="282033268">
-    <w:abstractNumId w:val="18"/>
+    <w:abstractNumId w:val="24"/>
   </w:num>
   <w:num w:numId="12" w16cid:durableId="1900898234">
-    <w:abstractNumId w:val="9"/>
+    <w:abstractNumId w:val="14"/>
   </w:num>
   <w:num w:numId="13" w16cid:durableId="1921285434">
-    <w:abstractNumId w:val="28"/>
+    <w:abstractNumId w:val="38"/>
   </w:num>
   <w:num w:numId="14" w16cid:durableId="54474949">
     <w:abstractNumId w:val="0"/>
   </w:num>
   <w:num w:numId="15" w16cid:durableId="870190040">
-    <w:abstractNumId w:val="4"/>
+    <w:abstractNumId w:val="5"/>
   </w:num>
   <w:num w:numId="16" w16cid:durableId="2028553356">
-    <w:abstractNumId w:val="29"/>
+    <w:abstractNumId w:val="39"/>
   </w:num>
   <w:num w:numId="17" w16cid:durableId="591014610">
     <w:abstractNumId w:val="1"/>
   </w:num>
   <w:num w:numId="18" w16cid:durableId="406151587">
-    <w:abstractNumId w:val="27"/>
+    <w:abstractNumId w:val="37"/>
   </w:num>
   <w:num w:numId="19" w16cid:durableId="1296522490">
-    <w:abstractNumId w:val="11"/>
+    <w:abstractNumId w:val="17"/>
   </w:num>
   <w:num w:numId="20" w16cid:durableId="1996520160">
-    <w:abstractNumId w:val="14"/>
+    <w:abstractNumId w:val="20"/>
   </w:num>
   <w:num w:numId="21" w16cid:durableId="791485427">
-    <w:abstractNumId w:val="24"/>
+    <w:abstractNumId w:val="32"/>
   </w:num>
   <w:num w:numId="22" w16cid:durableId="1497460403">
-    <w:abstractNumId w:val="6"/>
+    <w:abstractNumId w:val="10"/>
   </w:num>
   <w:num w:numId="23" w16cid:durableId="1127817319">
-    <w:abstractNumId w:val="10"/>
+    <w:abstractNumId w:val="16"/>
   </w:num>
   <w:num w:numId="24" w16cid:durableId="724178196">
-    <w:abstractNumId w:val="21"/>
+    <w:abstractNumId w:val="29"/>
   </w:num>
   <w:num w:numId="25" w16cid:durableId="182717555">
+    <w:abstractNumId w:val="19"/>
+  </w:num>
+  <w:num w:numId="26" w16cid:durableId="478159783">
+    <w:abstractNumId w:val="31"/>
+  </w:num>
+  <w:num w:numId="27" w16cid:durableId="174998487">
+    <w:abstractNumId w:val="22"/>
+  </w:num>
+  <w:num w:numId="28" w16cid:durableId="411393664">
     <w:abstractNumId w:val="13"/>
   </w:num>
-  <w:num w:numId="26" w16cid:durableId="478159783">
-    <w:abstractNumId w:val="23"/>
-  </w:num>
-  <w:num w:numId="27" w16cid:durableId="174998487">
-    <w:abstractNumId w:val="16"/>
-  </w:num>
-  <w:num w:numId="28" w16cid:durableId="411393664">
-    <w:abstractNumId w:val="8"/>
-  </w:num>
   <w:num w:numId="29" w16cid:durableId="2024433274">
-    <w:abstractNumId w:val="7"/>
+    <w:abstractNumId w:val="11"/>
   </w:num>
   <w:num w:numId="30" w16cid:durableId="1389762930">
     <w:abstractNumId w:val="2"/>
   </w:num>
   <w:num w:numId="31" w16cid:durableId="1925064846">
+    <w:abstractNumId w:val="18"/>
+  </w:num>
+  <w:num w:numId="32" w16cid:durableId="888806455">
+    <w:abstractNumId w:val="7"/>
+  </w:num>
+  <w:num w:numId="33" w16cid:durableId="181283547">
+    <w:abstractNumId w:val="26"/>
+  </w:num>
+  <w:num w:numId="34" w16cid:durableId="509180366">
+    <w:abstractNumId w:val="8"/>
+  </w:num>
+  <w:num w:numId="35" w16cid:durableId="1110902260">
     <w:abstractNumId w:val="12"/>
+  </w:num>
+  <w:num w:numId="36" w16cid:durableId="1257592171">
+    <w:abstractNumId w:val="15"/>
+  </w:num>
+  <w:num w:numId="37" w16cid:durableId="3479956">
+    <w:abstractNumId w:val="42"/>
+  </w:num>
+  <w:num w:numId="38" w16cid:durableId="1719276697">
+    <w:abstractNumId w:val="28"/>
+  </w:num>
+  <w:num w:numId="39" w16cid:durableId="721445009">
+    <w:abstractNumId w:val="34"/>
+  </w:num>
+  <w:num w:numId="40" w16cid:durableId="1375891146">
+    <w:abstractNumId w:val="3"/>
+  </w:num>
+  <w:num w:numId="41" w16cid:durableId="566648891">
+    <w:abstractNumId w:val="35"/>
+  </w:num>
+  <w:num w:numId="42" w16cid:durableId="1294604932">
+    <w:abstractNumId w:val="40"/>
+  </w:num>
+  <w:num w:numId="43" w16cid:durableId="405342975">
+    <w:abstractNumId w:val="6"/>
   </w:num>
   <w:numIdMacAtCleanup w:val="7"/>
 </w:numbering>
@@ -5275,6 +7708,7 @@
   <w:style w:type="character" w:default="1" w:styleId="DefaultParagraphFont">
     <w:name w:val="Default Paragraph Font"/>
     <w:uiPriority w:val="1"/>
+    <w:semiHidden/>
     <w:unhideWhenUsed/>
   </w:style>
   <w:style w:type="table" w:default="1" w:styleId="TableNormal">

</xml_diff>